<commit_message>
Finished Lab 7 and Added pre-lab 8 stuff
</commit_message>
<xml_diff>
--- a/Lab-7_Diode-Applications/Lab-7_Diode-Applications.docx
+++ b/Lab-7_Diode-Applications/Lab-7_Diode-Applications.docx
@@ -95,25 +95,7 @@
           <w:sz w:val="24"/>
           <w:szCs w:val="24"/>
         </w:rPr>
-        <w:t xml:space="preserve"> capacitors, and threshold clip detection using voltage comparators. We also explore forward-bias diode characteristics, potentiometer voltage dividers, and simulation techniques in </w:t>
-      </w:r>
-      <w:proofErr w:type="spellStart"/>
-      <w:r>
-        <w:rPr>
-          <w:rFonts w:ascii="Times New Roman" w:eastAsia="Times New Roman" w:hAnsi="Times New Roman" w:cs="Times New Roman"/>
-          <w:sz w:val="24"/>
-          <w:szCs w:val="24"/>
-        </w:rPr>
-        <w:t>LTspice</w:t>
-      </w:r>
-      <w:proofErr w:type="spellEnd"/>
-      <w:r>
-        <w:rPr>
-          <w:rFonts w:ascii="Times New Roman" w:eastAsia="Times New Roman" w:hAnsi="Times New Roman" w:cs="Times New Roman"/>
-          <w:sz w:val="24"/>
-          <w:szCs w:val="24"/>
-        </w:rPr>
-        <w:t xml:space="preserve"> alongside physical breadboard implementations.</w:t>
+        <w:t xml:space="preserve"> capacitors, and threshold clip detection using voltage comparators. We also explore forward-bias diode characteristics, potentiometer voltage dividers, and simulation techniques in LTspice alongside physical breadboard implementations.</w:t>
       </w:r>
     </w:p>
     <w:p>
@@ -245,18 +227,8 @@
           <w:sz w:val="28"/>
           <w:szCs w:val="28"/>
         </w:rPr>
-        <w:t xml:space="preserve">Laptop with </w:t>
-      </w:r>
-      <w:proofErr w:type="spellStart"/>
-      <w:r>
-        <w:rPr>
-          <w:rFonts w:ascii="Times New Roman" w:hAnsi="Times New Roman" w:cs="Times New Roman"/>
-          <w:sz w:val="28"/>
-          <w:szCs w:val="28"/>
-        </w:rPr>
-        <w:t>LTSpice</w:t>
-      </w:r>
-      <w:proofErr w:type="spellEnd"/>
+        <w:t>Laptop with LTSpice</w:t>
+      </w:r>
     </w:p>
     <w:p>
       <w:pPr>
@@ -456,6 +428,7 @@
       <w:r>
         <w:rPr>
           <w:rFonts w:ascii="Times New Roman" w:hAnsi="Times New Roman" w:cs="Times New Roman"/>
+          <w:noProof/>
           <w:sz w:val="28"/>
           <w:szCs w:val="28"/>
         </w:rPr>
@@ -526,6 +499,9 @@
         <w:t>1</w:t>
       </w:r>
       <w:r>
+        <w:rPr>
+          <w:noProof/>
+        </w:rPr>
         <w:fldChar w:fldCharType="end"/>
       </w:r>
       <w:r>
@@ -654,6 +630,7 @@
       <w:r>
         <w:rPr>
           <w:rFonts w:ascii="Times New Roman" w:hAnsi="Times New Roman" w:cs="Times New Roman"/>
+          <w:noProof/>
           <w:sz w:val="28"/>
           <w:szCs w:val="28"/>
         </w:rPr>
@@ -724,6 +701,9 @@
         <w:t>2</w:t>
       </w:r>
       <w:r>
+        <w:rPr>
+          <w:noProof/>
+        </w:rPr>
         <w:fldChar w:fldCharType="end"/>
       </w:r>
       <w:r>
@@ -761,6 +741,7 @@
       <w:r>
         <w:rPr>
           <w:rFonts w:ascii="Times New Roman" w:hAnsi="Times New Roman" w:cs="Times New Roman"/>
+          <w:noProof/>
           <w:sz w:val="28"/>
           <w:szCs w:val="28"/>
         </w:rPr>
@@ -830,6 +811,9 @@
         <w:t>3</w:t>
       </w:r>
       <w:r>
+        <w:rPr>
+          <w:noProof/>
+        </w:rPr>
         <w:fldChar w:fldCharType="end"/>
       </w:r>
       <w:r>
@@ -897,6 +881,7 @@
       <w:r>
         <w:rPr>
           <w:rFonts w:ascii="Times New Roman" w:hAnsi="Times New Roman" w:cs="Times New Roman"/>
+          <w:noProof/>
           <w:sz w:val="28"/>
           <w:szCs w:val="28"/>
         </w:rPr>
@@ -966,6 +951,9 @@
         <w:t>4</w:t>
       </w:r>
       <w:r>
+        <w:rPr>
+          <w:noProof/>
+        </w:rPr>
         <w:fldChar w:fldCharType="end"/>
       </w:r>
       <w:r>
@@ -1062,6 +1050,7 @@
       <w:r>
         <w:rPr>
           <w:rFonts w:ascii="Times New Roman" w:hAnsi="Times New Roman" w:cs="Times New Roman"/>
+          <w:noProof/>
           <w:sz w:val="28"/>
           <w:szCs w:val="28"/>
         </w:rPr>
@@ -1132,6 +1121,9 @@
         <w:t>5</w:t>
       </w:r>
       <w:r>
+        <w:rPr>
+          <w:noProof/>
+        </w:rPr>
         <w:fldChar w:fldCharType="end"/>
       </w:r>
       <w:r>
@@ -1217,6 +1209,7 @@
       <w:r>
         <w:rPr>
           <w:rFonts w:ascii="Times New Roman" w:hAnsi="Times New Roman" w:cs="Times New Roman"/>
+          <w:noProof/>
           <w:sz w:val="28"/>
           <w:szCs w:val="28"/>
         </w:rPr>
@@ -1287,6 +1280,9 @@
         <w:t>6</w:t>
       </w:r>
       <w:r>
+        <w:rPr>
+          <w:noProof/>
+        </w:rPr>
         <w:fldChar w:fldCharType="end"/>
       </w:r>
       <w:r>
@@ -1331,25 +1327,7 @@
           <w:sz w:val="28"/>
           <w:szCs w:val="28"/>
         </w:rPr>
-        <w:t xml:space="preserve">You can also use the potentiometer as a voltage divider. To do this, you would connect all three terminals: one outer terminal to </w:t>
-      </w:r>
-      <w:proofErr w:type="spellStart"/>
-      <w:r>
-        <w:rPr>
-          <w:rFonts w:ascii="Times New Roman" w:hAnsi="Times New Roman" w:cs="Times New Roman"/>
-          <w:sz w:val="28"/>
-          <w:szCs w:val="28"/>
-        </w:rPr>
-        <w:t>Vcc</w:t>
-      </w:r>
-      <w:proofErr w:type="spellEnd"/>
-      <w:r>
-        <w:rPr>
-          <w:rFonts w:ascii="Times New Roman" w:hAnsi="Times New Roman" w:cs="Times New Roman"/>
-          <w:sz w:val="28"/>
-          <w:szCs w:val="28"/>
-        </w:rPr>
-        <w:t xml:space="preserve">, the other outer terminal to GND, and the center terminal becomes the adjustable voltage output. </w:t>
+        <w:t xml:space="preserve">You can also use the potentiometer as a voltage divider. To do this, you would connect all three terminals: one outer terminal to Vcc, the other outer terminal to GND, and the center terminal becomes the adjustable voltage output. </w:t>
       </w:r>
     </w:p>
     <w:p>
@@ -1368,61 +1346,7 @@
           <w:sz w:val="28"/>
           <w:szCs w:val="28"/>
         </w:rPr>
-        <w:t xml:space="preserve">In </w:t>
-      </w:r>
-      <w:proofErr w:type="spellStart"/>
-      <w:r>
-        <w:rPr>
-          <w:rFonts w:ascii="Times New Roman" w:hAnsi="Times New Roman" w:cs="Times New Roman"/>
-          <w:sz w:val="28"/>
-          <w:szCs w:val="28"/>
-        </w:rPr>
-        <w:t>LTspice</w:t>
-      </w:r>
-      <w:proofErr w:type="spellEnd"/>
-      <w:r>
-        <w:rPr>
-          <w:rFonts w:ascii="Times New Roman" w:hAnsi="Times New Roman" w:cs="Times New Roman"/>
-          <w:sz w:val="28"/>
-          <w:szCs w:val="28"/>
-        </w:rPr>
-        <w:t>, a potentiometer is modeled using a resistor with a variable resistance. Instead of a dedicated component, you can define a resistor’s value as {</w:t>
-      </w:r>
-      <w:proofErr w:type="spellStart"/>
-      <w:r>
-        <w:rPr>
-          <w:rFonts w:ascii="Times New Roman" w:hAnsi="Times New Roman" w:cs="Times New Roman"/>
-          <w:sz w:val="28"/>
-          <w:szCs w:val="28"/>
-        </w:rPr>
-        <w:t>R_total</w:t>
-      </w:r>
-      <w:proofErr w:type="spellEnd"/>
-      <w:r>
-        <w:rPr>
-          <w:rFonts w:ascii="Times New Roman" w:hAnsi="Times New Roman" w:cs="Times New Roman"/>
-          <w:sz w:val="28"/>
-          <w:szCs w:val="28"/>
-        </w:rPr>
-        <w:t xml:space="preserve"> * w}, where </w:t>
-      </w:r>
-      <w:proofErr w:type="spellStart"/>
-      <w:r>
-        <w:rPr>
-          <w:rFonts w:ascii="Times New Roman" w:hAnsi="Times New Roman" w:cs="Times New Roman"/>
-          <w:sz w:val="28"/>
-          <w:szCs w:val="28"/>
-        </w:rPr>
-        <w:t>R_total</w:t>
-      </w:r>
-      <w:proofErr w:type="spellEnd"/>
-      <w:r>
-        <w:rPr>
-          <w:rFonts w:ascii="Times New Roman" w:hAnsi="Times New Roman" w:cs="Times New Roman"/>
-          <w:sz w:val="28"/>
-          <w:szCs w:val="28"/>
-        </w:rPr>
-        <w:t xml:space="preserve"> is the max resistance (10k) and w (ranging from 0 to 1) represents the wiper position. For example, if you want the pot to be 5kΩ, the value of w would be 0.5 and the spice directive would be: </w:t>
+        <w:t xml:space="preserve">In LTspice, a potentiometer is modeled using a resistor with a variable resistance. Instead of a dedicated component, you can define a resistor’s value as {R_total * w}, where R_total is the max resistance (10k) and w (ranging from 0 to 1) represents the wiper position. For example, if you want the pot to be 5kΩ, the value of w would be 0.5 and the spice directive would be: </w:t>
       </w:r>
     </w:p>
     <w:p>
@@ -1435,23 +1359,13 @@
           <w:szCs w:val="28"/>
         </w:rPr>
       </w:pPr>
-      <w:proofErr w:type="gramStart"/>
-      <w:r>
-        <w:rPr>
-          <w:rFonts w:ascii="Times New Roman" w:hAnsi="Times New Roman" w:cs="Times New Roman"/>
-          <w:sz w:val="28"/>
-          <w:szCs w:val="28"/>
-        </w:rPr>
-        <w:t>.param</w:t>
-      </w:r>
-      <w:proofErr w:type="gramEnd"/>
-      <w:r>
-        <w:rPr>
-          <w:rFonts w:ascii="Times New Roman" w:hAnsi="Times New Roman" w:cs="Times New Roman"/>
-          <w:sz w:val="28"/>
-          <w:szCs w:val="28"/>
-        </w:rPr>
-        <w:t xml:space="preserve"> w=0.5 </w:t>
+      <w:r>
+        <w:rPr>
+          <w:rFonts w:ascii="Times New Roman" w:hAnsi="Times New Roman" w:cs="Times New Roman"/>
+          <w:sz w:val="28"/>
+          <w:szCs w:val="28"/>
+        </w:rPr>
+        <w:t xml:space="preserve">.param w=0.5 </w:t>
       </w:r>
     </w:p>
     <w:p>
@@ -1471,25 +1385,7 @@
           <w:szCs w:val="28"/>
         </w:rPr>
         <w:lastRenderedPageBreak/>
-        <w:t xml:space="preserve">You can also calculate the resistance you need and just assign that value to the resistor in your schematic. To recall how variables work in </w:t>
-      </w:r>
-      <w:proofErr w:type="spellStart"/>
-      <w:r>
-        <w:rPr>
-          <w:rFonts w:ascii="Times New Roman" w:hAnsi="Times New Roman" w:cs="Times New Roman"/>
-          <w:sz w:val="28"/>
-          <w:szCs w:val="28"/>
-        </w:rPr>
-        <w:t>LTspice</w:t>
-      </w:r>
-      <w:proofErr w:type="spellEnd"/>
-      <w:r>
-        <w:rPr>
-          <w:rFonts w:ascii="Times New Roman" w:hAnsi="Times New Roman" w:cs="Times New Roman"/>
-          <w:sz w:val="28"/>
-          <w:szCs w:val="28"/>
-        </w:rPr>
-        <w:t xml:space="preserve">, look back to the Monte Carlo simulations in Lab 2 where we define resistor tolerances. </w:t>
+        <w:t xml:space="preserve">You can also calculate the resistance you need and just assign that value to the resistor in your schematic. To recall how variables work in LTspice, look back to the Monte Carlo simulations in Lab 2 where we define resistor tolerances. </w:t>
       </w:r>
     </w:p>
     <w:p>
@@ -1530,6 +1426,7 @@
       <w:r>
         <w:rPr>
           <w:rFonts w:ascii="Times New Roman" w:hAnsi="Times New Roman" w:cs="Times New Roman"/>
+          <w:noProof/>
           <w:sz w:val="28"/>
           <w:szCs w:val="28"/>
         </w:rPr>
@@ -1599,6 +1496,9 @@
         <w:t>7</w:t>
       </w:r>
       <w:r>
+        <w:rPr>
+          <w:noProof/>
+        </w:rPr>
         <w:fldChar w:fldCharType="end"/>
       </w:r>
       <w:r>
@@ -1710,31 +1610,7 @@
           <w:sz w:val="34"/>
           <w:szCs w:val="34"/>
         </w:rPr>
-        <w:t xml:space="preserve"> </w:t>
-      </w:r>
-      <w:proofErr w:type="spellStart"/>
-      <w:r>
-        <w:rPr>
-          <w:rFonts w:ascii="Times New Roman" w:hAnsi="Times New Roman" w:cs="Times New Roman"/>
-          <w:b/>
-          <w:bCs/>
-          <w:w w:val="105"/>
-          <w:sz w:val="34"/>
-          <w:szCs w:val="34"/>
-        </w:rPr>
-        <w:t>LTspice</w:t>
-      </w:r>
-      <w:proofErr w:type="spellEnd"/>
-      <w:r>
-        <w:rPr>
-          <w:rFonts w:ascii="Times New Roman" w:hAnsi="Times New Roman" w:cs="Times New Roman"/>
-          <w:b/>
-          <w:bCs/>
-          <w:w w:val="105"/>
-          <w:sz w:val="34"/>
-          <w:szCs w:val="34"/>
-        </w:rPr>
-        <w:t xml:space="preserve"> Simulations</w:t>
+        <w:t xml:space="preserve"> LTspice Simulations</w:t>
       </w:r>
     </w:p>
     <w:p>
@@ -1753,25 +1629,7 @@
           <w:sz w:val="28"/>
           <w:szCs w:val="28"/>
         </w:rPr>
-        <w:t xml:space="preserve">Using </w:t>
-      </w:r>
-      <w:proofErr w:type="spellStart"/>
-      <w:r>
-        <w:rPr>
-          <w:rFonts w:ascii="Times New Roman" w:hAnsi="Times New Roman" w:cs="Times New Roman"/>
-          <w:sz w:val="28"/>
-          <w:szCs w:val="28"/>
-        </w:rPr>
-        <w:t>LTspice</w:t>
-      </w:r>
-      <w:proofErr w:type="spellEnd"/>
-      <w:r>
-        <w:rPr>
-          <w:rFonts w:ascii="Times New Roman" w:hAnsi="Times New Roman" w:cs="Times New Roman"/>
-          <w:sz w:val="28"/>
-          <w:szCs w:val="28"/>
-        </w:rPr>
-        <w:t xml:space="preserve">, complete the following. </w:t>
+        <w:t xml:space="preserve">Using LTspice, complete the following. </w:t>
       </w:r>
     </w:p>
     <w:p>
@@ -1794,53 +1652,7 @@
           <w:sz w:val="28"/>
           <w:szCs w:val="28"/>
         </w:rPr>
-        <w:t xml:space="preserve">Build the circuit in Figure 7.2 (a). Set the input to a 1 kHz, 5 V amplitude sine wave and run a transient simulation with a stop time of 1m </w:t>
-      </w:r>
-      <w:proofErr w:type="gramStart"/>
-      <w:r>
-        <w:rPr>
-          <w:rFonts w:ascii="Times New Roman" w:hAnsi="Times New Roman" w:cs="Times New Roman"/>
-          <w:sz w:val="28"/>
-          <w:szCs w:val="28"/>
-        </w:rPr>
-        <w:t>(.</w:t>
-      </w:r>
-      <w:proofErr w:type="spellStart"/>
-      <w:r>
-        <w:rPr>
-          <w:rFonts w:ascii="Times New Roman" w:hAnsi="Times New Roman" w:cs="Times New Roman"/>
-          <w:sz w:val="28"/>
-          <w:szCs w:val="28"/>
-        </w:rPr>
-        <w:t>tran</w:t>
-      </w:r>
-      <w:proofErr w:type="spellEnd"/>
-      <w:proofErr w:type="gramEnd"/>
-      <w:r>
-        <w:rPr>
-          <w:rFonts w:ascii="Times New Roman" w:hAnsi="Times New Roman" w:cs="Times New Roman"/>
-          <w:sz w:val="28"/>
-          <w:szCs w:val="28"/>
-        </w:rPr>
-        <w:t xml:space="preserve"> 1m) and plot the input and output. To use the 1N4148 diode model, right click on the diode after placing it, Pick New Diode, and then choose the 1N4148 model (Mfg. </w:t>
-      </w:r>
-      <w:proofErr w:type="spellStart"/>
-      <w:r>
-        <w:rPr>
-          <w:rFonts w:ascii="Times New Roman" w:hAnsi="Times New Roman" w:cs="Times New Roman"/>
-          <w:sz w:val="28"/>
-          <w:szCs w:val="28"/>
-        </w:rPr>
-        <w:t>OnSemi</w:t>
-      </w:r>
-      <w:proofErr w:type="spellEnd"/>
-      <w:r>
-        <w:rPr>
-          <w:rFonts w:ascii="Times New Roman" w:hAnsi="Times New Roman" w:cs="Times New Roman"/>
-          <w:sz w:val="28"/>
-          <w:szCs w:val="28"/>
-        </w:rPr>
-        <w:t>). Save an image of the circuit and the plot of the input and output voltage.</w:t>
+        <w:t>Build the circuit in Figure 7.2 (a). Set the input to a 1 kHz, 5 V amplitude sine wave and run a transient simulation with a stop time of 1m (.tran 1m) and plot the input and output. To use the 1N4148 diode model, right click on the diode after placing it, Pick New Diode, and then choose the 1N4148 model (Mfg. OnSemi). Save an image of the circuit and the plot of the input and output voltage.</w:t>
       </w:r>
     </w:p>
     <w:p>
@@ -1852,6 +1664,7 @@
       <w:r>
         <w:rPr>
           <w:rFonts w:ascii="Times New Roman" w:hAnsi="Times New Roman" w:cs="Times New Roman"/>
+          <w:noProof/>
           <w:sz w:val="28"/>
           <w:szCs w:val="28"/>
         </w:rPr>
@@ -1920,6 +1733,9 @@
         <w:t>1</w:t>
       </w:r>
       <w:r>
+        <w:rPr>
+          <w:noProof/>
+        </w:rPr>
         <w:fldChar w:fldCharType="end"/>
       </w:r>
       <w:r>
@@ -1929,35 +1745,7 @@
         <w:rPr>
           <w:rFonts w:cstheme="minorHAnsi"/>
         </w:rPr>
-        <w:t>C</w:t>
-      </w:r>
-      <w:r>
-        <w:rPr>
-          <w:rFonts w:cstheme="minorHAnsi"/>
-        </w:rPr>
-        <w:t xml:space="preserve">ircuit in Figure 7.2 (a). Set the input to a 1 kHz, 5 V amplitude sine wave and run a transient simulation with a stop time of 1m </w:t>
-      </w:r>
-      <w:proofErr w:type="gramStart"/>
-      <w:r>
-        <w:rPr>
-          <w:rFonts w:cstheme="minorHAnsi"/>
-        </w:rPr>
-        <w:t>(.</w:t>
-      </w:r>
-      <w:proofErr w:type="spellStart"/>
-      <w:r>
-        <w:rPr>
-          <w:rFonts w:cstheme="minorHAnsi"/>
-        </w:rPr>
-        <w:t>tran</w:t>
-      </w:r>
-      <w:proofErr w:type="spellEnd"/>
-      <w:proofErr w:type="gramEnd"/>
-      <w:r>
-        <w:rPr>
-          <w:rFonts w:cstheme="minorHAnsi"/>
-        </w:rPr>
-        <w:t xml:space="preserve"> 1m) and plot the input and output.</w:t>
+        <w:t>Circuit in Figure 7.2 (a). Set the input to a 1 kHz, 5 V amplitude sine wave and run a transient simulation with a stop time of 1m (.tran 1m) and plot the input and output.</w:t>
       </w:r>
     </w:p>
     <w:p>
@@ -1980,53 +1768,7 @@
           <w:sz w:val="28"/>
           <w:szCs w:val="28"/>
         </w:rPr>
-        <w:t xml:space="preserve">Build the circuit </w:t>
-      </w:r>
-      <w:proofErr w:type="gramStart"/>
-      <w:r>
-        <w:rPr>
-          <w:rFonts w:ascii="Times New Roman" w:hAnsi="Times New Roman" w:cs="Times New Roman"/>
-          <w:sz w:val="28"/>
-          <w:szCs w:val="28"/>
-        </w:rPr>
-        <w:t>in ,</w:t>
-      </w:r>
-      <w:proofErr w:type="gramEnd"/>
-      <w:r>
-        <w:rPr>
-          <w:rFonts w:ascii="Times New Roman" w:hAnsi="Times New Roman" w:cs="Times New Roman"/>
-          <w:sz w:val="28"/>
-          <w:szCs w:val="28"/>
-        </w:rPr>
-        <w:t xml:space="preserve"> Figure 7.3 (a). Set the input to a 100 kHz, 5 V amplitude sine wave and run a transient simulation with a stop time of 50u </w:t>
-      </w:r>
-      <w:proofErr w:type="gramStart"/>
-      <w:r>
-        <w:rPr>
-          <w:rFonts w:ascii="Times New Roman" w:hAnsi="Times New Roman" w:cs="Times New Roman"/>
-          <w:sz w:val="28"/>
-          <w:szCs w:val="28"/>
-        </w:rPr>
-        <w:t>(.</w:t>
-      </w:r>
-      <w:proofErr w:type="spellStart"/>
-      <w:r>
-        <w:rPr>
-          <w:rFonts w:ascii="Times New Roman" w:hAnsi="Times New Roman" w:cs="Times New Roman"/>
-          <w:sz w:val="28"/>
-          <w:szCs w:val="28"/>
-        </w:rPr>
-        <w:t>tran</w:t>
-      </w:r>
-      <w:proofErr w:type="spellEnd"/>
-      <w:proofErr w:type="gramEnd"/>
-      <w:r>
-        <w:rPr>
-          <w:rFonts w:ascii="Times New Roman" w:hAnsi="Times New Roman" w:cs="Times New Roman"/>
-          <w:sz w:val="28"/>
-          <w:szCs w:val="28"/>
-        </w:rPr>
-        <w:t xml:space="preserve"> 50u) and step through possible capacitor values using the following spice directive: </w:t>
+        <w:t xml:space="preserve">Build the circuit in , Figure 7.3 (a). Set the input to a 100 kHz, 5 V amplitude sine wave and run a transient simulation with a stop time of 50u (.tran 50u) and step through possible capacitor values using the following spice directive: </w:t>
       </w:r>
     </w:p>
     <w:p>
@@ -2052,23 +1794,13 @@
           <w:szCs w:val="28"/>
         </w:rPr>
       </w:pPr>
-      <w:proofErr w:type="gramStart"/>
-      <w:r>
-        <w:rPr>
-          <w:rFonts w:ascii="Times New Roman" w:hAnsi="Times New Roman" w:cs="Times New Roman"/>
-          <w:sz w:val="28"/>
-          <w:szCs w:val="28"/>
-        </w:rPr>
-        <w:t>.step</w:t>
-      </w:r>
-      <w:proofErr w:type="gramEnd"/>
-      <w:r>
-        <w:rPr>
-          <w:rFonts w:ascii="Times New Roman" w:hAnsi="Times New Roman" w:cs="Times New Roman"/>
-          <w:sz w:val="28"/>
-          <w:szCs w:val="28"/>
-        </w:rPr>
-        <w:t xml:space="preserve"> param C list 0.001u 0.01u 0.1u 1u </w:t>
+      <w:r>
+        <w:rPr>
+          <w:rFonts w:ascii="Times New Roman" w:hAnsi="Times New Roman" w:cs="Times New Roman"/>
+          <w:sz w:val="28"/>
+          <w:szCs w:val="28"/>
+        </w:rPr>
+        <w:t xml:space="preserve">.step param C list 0.001u 0.01u 0.1u 1u </w:t>
       </w:r>
     </w:p>
     <w:p>
@@ -2120,6 +1852,7 @@
       <w:r>
         <w:rPr>
           <w:rFonts w:ascii="Times New Roman" w:hAnsi="Times New Roman" w:cs="Times New Roman"/>
+          <w:noProof/>
           <w:sz w:val="28"/>
           <w:szCs w:val="28"/>
         </w:rPr>
@@ -2188,6 +1921,9 @@
         <w:t>2</w:t>
       </w:r>
       <w:r>
+        <w:rPr>
+          <w:noProof/>
+        </w:rPr>
         <w:fldChar w:fldCharType="end"/>
       </w:r>
       <w:r>
@@ -2197,35 +1933,7 @@
         <w:rPr>
           <w:rFonts w:cstheme="minorHAnsi"/>
         </w:rPr>
-        <w:t>C</w:t>
-      </w:r>
-      <w:r>
-        <w:rPr>
-          <w:rFonts w:cstheme="minorHAnsi"/>
-        </w:rPr>
-        <w:t xml:space="preserve">ircuit in Figure 7.3 (a). Set the input to a 100 kHz, 5 V amplitude sine wave and run a transient simulation with a stop time of 50u </w:t>
-      </w:r>
-      <w:proofErr w:type="gramStart"/>
-      <w:r>
-        <w:rPr>
-          <w:rFonts w:cstheme="minorHAnsi"/>
-        </w:rPr>
-        <w:t>(.</w:t>
-      </w:r>
-      <w:proofErr w:type="spellStart"/>
-      <w:r>
-        <w:rPr>
-          <w:rFonts w:cstheme="minorHAnsi"/>
-        </w:rPr>
-        <w:t>tran</w:t>
-      </w:r>
-      <w:proofErr w:type="spellEnd"/>
-      <w:proofErr w:type="gramEnd"/>
-      <w:r>
-        <w:rPr>
-          <w:rFonts w:cstheme="minorHAnsi"/>
-        </w:rPr>
-        <w:t xml:space="preserve"> 50u) and step through possible capacitor values</w:t>
+        <w:t>Circuit in Figure 7.3 (a). Set the input to a 100 kHz, 5 V amplitude sine wave and run a transient simulation with a stop time of 50u (.tran 50u) and step through possible capacitor values</w:t>
       </w:r>
     </w:p>
     <w:p>
@@ -2248,53 +1956,7 @@
           <w:sz w:val="28"/>
           <w:szCs w:val="28"/>
         </w:rPr>
-        <w:t xml:space="preserve">Rebuild the circuit in Figure 7.4 (a) in </w:t>
-      </w:r>
-      <w:proofErr w:type="spellStart"/>
-      <w:r>
-        <w:rPr>
-          <w:rFonts w:ascii="Times New Roman" w:hAnsi="Times New Roman" w:cs="Times New Roman"/>
-          <w:sz w:val="28"/>
-          <w:szCs w:val="28"/>
-        </w:rPr>
-        <w:t>LTspice</w:t>
-      </w:r>
-      <w:proofErr w:type="spellEnd"/>
-      <w:r>
-        <w:rPr>
-          <w:rFonts w:ascii="Times New Roman" w:hAnsi="Times New Roman" w:cs="Times New Roman"/>
-          <w:sz w:val="28"/>
-          <w:szCs w:val="28"/>
-        </w:rPr>
-        <w:t xml:space="preserve"> and plot the input and output voltages. Use the 1N4148 diode and a sinusoidal input volage with 0 V offset, 5 V amplitude, and 200 Hz frequency. When plotting the output voltage, you must plot the difference between the two nodes of the load, just like in Figure 7.4 (b). </w:t>
-      </w:r>
-      <w:proofErr w:type="gramStart"/>
-      <w:r>
-        <w:rPr>
-          <w:rFonts w:ascii="Times New Roman" w:hAnsi="Times New Roman" w:cs="Times New Roman"/>
-          <w:sz w:val="28"/>
-          <w:szCs w:val="28"/>
-        </w:rPr>
-        <w:t>Use .</w:t>
-      </w:r>
-      <w:proofErr w:type="spellStart"/>
-      <w:r>
-        <w:rPr>
-          <w:rFonts w:ascii="Times New Roman" w:hAnsi="Times New Roman" w:cs="Times New Roman"/>
-          <w:sz w:val="28"/>
-          <w:szCs w:val="28"/>
-        </w:rPr>
-        <w:t>tran</w:t>
-      </w:r>
-      <w:proofErr w:type="spellEnd"/>
-      <w:proofErr w:type="gramEnd"/>
-      <w:r>
-        <w:rPr>
-          <w:rFonts w:ascii="Times New Roman" w:hAnsi="Times New Roman" w:cs="Times New Roman"/>
-          <w:sz w:val="28"/>
-          <w:szCs w:val="28"/>
-        </w:rPr>
-        <w:t xml:space="preserve"> 10m for simulation. Take screenshots of the schematic and voltage waveforms.</w:t>
+        <w:t>Rebuild the circuit in Figure 7.4 (a) in LTspice and plot the input and output voltages. Use the 1N4148 diode and a sinusoidal input volage with 0 V offset, 5 V amplitude, and 200 Hz frequency. When plotting the output voltage, you must plot the difference between the two nodes of the load, just like in Figure 7.4 (b). Use .tran 10m for simulation. Take screenshots of the schematic and voltage waveforms.</w:t>
       </w:r>
     </w:p>
     <w:p>
@@ -2306,6 +1968,7 @@
       <w:r>
         <w:rPr>
           <w:rFonts w:ascii="Times New Roman" w:hAnsi="Times New Roman" w:cs="Times New Roman"/>
+          <w:noProof/>
           <w:sz w:val="28"/>
           <w:szCs w:val="28"/>
         </w:rPr>
@@ -2374,6 +2037,9 @@
         <w:t>3</w:t>
       </w:r>
       <w:r>
+        <w:rPr>
+          <w:noProof/>
+        </w:rPr>
         <w:fldChar w:fldCharType="end"/>
       </w:r>
       <w:r>
@@ -2383,47 +2049,7 @@
         <w:rPr>
           <w:rFonts w:cstheme="minorHAnsi"/>
         </w:rPr>
-        <w:t>Circuit</w:t>
-      </w:r>
-      <w:r>
-        <w:rPr>
-          <w:rFonts w:cstheme="minorHAnsi"/>
-        </w:rPr>
-        <w:t xml:space="preserve"> in Figure 7.4 (a) in </w:t>
-      </w:r>
-      <w:proofErr w:type="spellStart"/>
-      <w:r>
-        <w:rPr>
-          <w:rFonts w:cstheme="minorHAnsi"/>
-        </w:rPr>
-        <w:t>LTspice</w:t>
-      </w:r>
-      <w:proofErr w:type="spellEnd"/>
-      <w:r>
-        <w:rPr>
-          <w:rFonts w:cstheme="minorHAnsi"/>
-        </w:rPr>
-        <w:t xml:space="preserve"> and plot the input and output voltages. Use the 1N4148 diode and a sinusoidal input volage with 0 V offset, 5 V amplitude, and 200 Hz frequency.</w:t>
-      </w:r>
-      <w:r>
-        <w:rPr>
-          <w:rFonts w:cstheme="minorHAnsi"/>
-        </w:rPr>
-        <w:t xml:space="preserve"> With Vin and </w:t>
-      </w:r>
-      <w:proofErr w:type="spellStart"/>
-      <w:r>
-        <w:rPr>
-          <w:rFonts w:cstheme="minorHAnsi"/>
-        </w:rPr>
-        <w:t>Vout</w:t>
-      </w:r>
-      <w:proofErr w:type="spellEnd"/>
-      <w:r>
-        <w:rPr>
-          <w:rFonts w:cstheme="minorHAnsi"/>
-        </w:rPr>
-        <w:t xml:space="preserve"> plotted</w:t>
+        <w:t>Circuit in Figure 7.4 (a) in LTspice and plot the input and output voltages. Use the 1N4148 diode and a sinusoidal input volage with 0 V offset, 5 V amplitude, and 200 Hz frequency. With Vin and Vout plotted</w:t>
       </w:r>
     </w:p>
     <w:p>
@@ -2446,61 +2072,7 @@
           <w:sz w:val="28"/>
           <w:szCs w:val="28"/>
         </w:rPr>
-        <w:t xml:space="preserve">Build the circuit in Figure 7.5. Use the default LED model in </w:t>
-      </w:r>
-      <w:proofErr w:type="spellStart"/>
-      <w:r>
-        <w:rPr>
-          <w:rFonts w:ascii="Times New Roman" w:hAnsi="Times New Roman" w:cs="Times New Roman"/>
-          <w:sz w:val="28"/>
-          <w:szCs w:val="28"/>
-        </w:rPr>
-        <w:t>LTSpice</w:t>
-      </w:r>
-      <w:proofErr w:type="spellEnd"/>
-      <w:r>
-        <w:rPr>
-          <w:rFonts w:ascii="Times New Roman" w:hAnsi="Times New Roman" w:cs="Times New Roman"/>
-          <w:sz w:val="28"/>
-          <w:szCs w:val="28"/>
-        </w:rPr>
-        <w:t xml:space="preserve">, and download "slcj016.zip" file from Lab 7 folder for the LM393 comparator model. Ensure the unzipped file ends correctly by opening it in a text editor. The final line should be </w:t>
-      </w:r>
-      <w:proofErr w:type="gramStart"/>
-      <w:r>
-        <w:rPr>
-          <w:rFonts w:ascii="Times New Roman" w:hAnsi="Times New Roman" w:cs="Times New Roman"/>
-          <w:sz w:val="28"/>
-          <w:szCs w:val="28"/>
-        </w:rPr>
-        <w:t>“.ENDS</w:t>
-      </w:r>
-      <w:proofErr w:type="gramEnd"/>
-      <w:r>
-        <w:rPr>
-          <w:rFonts w:ascii="Times New Roman" w:hAnsi="Times New Roman" w:cs="Times New Roman"/>
-          <w:sz w:val="28"/>
-          <w:szCs w:val="28"/>
-        </w:rPr>
-        <w:t xml:space="preserve">” with no extra characters following it. If any exist, remove them, save the file, then proceed to import to </w:t>
-      </w:r>
-      <w:proofErr w:type="spellStart"/>
-      <w:r>
-        <w:rPr>
-          <w:rFonts w:ascii="Times New Roman" w:hAnsi="Times New Roman" w:cs="Times New Roman"/>
-          <w:sz w:val="28"/>
-          <w:szCs w:val="28"/>
-        </w:rPr>
-        <w:t>LTspice</w:t>
-      </w:r>
-      <w:proofErr w:type="spellEnd"/>
-      <w:r>
-        <w:rPr>
-          <w:rFonts w:ascii="Times New Roman" w:hAnsi="Times New Roman" w:cs="Times New Roman"/>
-          <w:sz w:val="28"/>
-          <w:szCs w:val="28"/>
-        </w:rPr>
-        <w:t xml:space="preserve">. </w:t>
+        <w:t xml:space="preserve">Build the circuit in Figure 7.5. Use the default LED model in LTSpice, and download "slcj016.zip" file from Lab 7 folder for the LM393 comparator model. Ensure the unzipped file ends correctly by opening it in a text editor. The final line should be “.ENDS” with no extra characters following it. If any exist, remove them, save the file, then proceed to import to LTspice. </w:t>
       </w:r>
     </w:p>
     <w:p>
@@ -2532,43 +2104,7 @@
           <w:sz w:val="28"/>
           <w:szCs w:val="28"/>
         </w:rPr>
-        <w:t xml:space="preserve">Import the model into </w:t>
-      </w:r>
-      <w:proofErr w:type="spellStart"/>
-      <w:r>
-        <w:rPr>
-          <w:rFonts w:ascii="Times New Roman" w:hAnsi="Times New Roman" w:cs="Times New Roman"/>
-          <w:sz w:val="28"/>
-          <w:szCs w:val="28"/>
-        </w:rPr>
-        <w:t>LTspice</w:t>
-      </w:r>
-      <w:proofErr w:type="spellEnd"/>
-      <w:r>
-        <w:rPr>
-          <w:rFonts w:ascii="Times New Roman" w:hAnsi="Times New Roman" w:cs="Times New Roman"/>
-          <w:sz w:val="28"/>
-          <w:szCs w:val="28"/>
-        </w:rPr>
-        <w:t xml:space="preserve"> using the “</w:t>
-      </w:r>
-      <w:proofErr w:type="spellStart"/>
-      <w:r>
-        <w:rPr>
-          <w:rFonts w:ascii="Times New Roman" w:hAnsi="Times New Roman" w:cs="Times New Roman"/>
-          <w:sz w:val="28"/>
-          <w:szCs w:val="28"/>
-        </w:rPr>
-        <w:t>LTspice</w:t>
-      </w:r>
-      <w:proofErr w:type="spellEnd"/>
-      <w:r>
-        <w:rPr>
-          <w:rFonts w:ascii="Times New Roman" w:hAnsi="Times New Roman" w:cs="Times New Roman"/>
-          <w:sz w:val="28"/>
-          <w:szCs w:val="28"/>
-        </w:rPr>
-        <w:t xml:space="preserve"> Component Import” documents in the lab folder. You can also find video instructions </w:t>
+        <w:t xml:space="preserve">Import the model into LTspice using the “LTspice Component Import” documents in the lab folder. You can also find video instructions </w:t>
       </w:r>
       <w:hyperlink r:id="rId18" w:history="1">
         <w:r>
@@ -2619,35 +2155,7 @@
           <w:sz w:val="28"/>
           <w:szCs w:val="28"/>
         </w:rPr>
-        <w:t xml:space="preserve">Power the LM393 with ±5 V. Set the input voltage to a 1 kHz, 5 V amplitude sine wave and run a transient solution with a stop time of 2m </w:t>
-      </w:r>
-      <w:proofErr w:type="gramStart"/>
-      <w:r>
-        <w:rPr>
-          <w:rFonts w:ascii="Times New Roman" w:hAnsi="Times New Roman" w:cs="Times New Roman"/>
-          <w:sz w:val="28"/>
-          <w:szCs w:val="28"/>
-        </w:rPr>
-        <w:t>(.</w:t>
-      </w:r>
-      <w:proofErr w:type="spellStart"/>
-      <w:r>
-        <w:rPr>
-          <w:rFonts w:ascii="Times New Roman" w:hAnsi="Times New Roman" w:cs="Times New Roman"/>
-          <w:sz w:val="28"/>
-          <w:szCs w:val="28"/>
-        </w:rPr>
-        <w:t>tran</w:t>
-      </w:r>
-      <w:proofErr w:type="spellEnd"/>
-      <w:proofErr w:type="gramEnd"/>
-      <w:r>
-        <w:rPr>
-          <w:rFonts w:ascii="Times New Roman" w:hAnsi="Times New Roman" w:cs="Times New Roman"/>
-          <w:sz w:val="28"/>
-          <w:szCs w:val="28"/>
-        </w:rPr>
-        <w:t xml:space="preserve"> 2m). Plot the input voltage and the current through each diode. Save an image of the circuit and the plot.</w:t>
+        <w:t>Power the LM393 with ±5 V. Set the input voltage to a 1 kHz, 5 V amplitude sine wave and run a transient solution with a stop time of 2m (.tran 2m). Plot the input voltage and the current through each diode. Save an image of the circuit and the plot.</w:t>
       </w:r>
     </w:p>
     <w:p>
@@ -2659,6 +2167,7 @@
       <w:r>
         <w:rPr>
           <w:rFonts w:ascii="Times New Roman" w:hAnsi="Times New Roman" w:cs="Times New Roman"/>
+          <w:noProof/>
           <w:sz w:val="28"/>
           <w:szCs w:val="28"/>
         </w:rPr>
@@ -2727,6 +2236,9 @@
         <w:t>4</w:t>
       </w:r>
       <w:r>
+        <w:rPr>
+          <w:noProof/>
+        </w:rPr>
         <w:fldChar w:fldCharType="end"/>
       </w:r>
       <w:r>
@@ -2736,35 +2248,7 @@
         <w:rPr>
           <w:rFonts w:cstheme="minorHAnsi"/>
         </w:rPr>
-        <w:t>Circuit</w:t>
-      </w:r>
-      <w:r>
-        <w:rPr>
-          <w:rFonts w:cstheme="minorHAnsi"/>
-        </w:rPr>
-        <w:t xml:space="preserve"> in Figure 7.5. Power the LM393 with ±5 V. Set the input voltage to a 1 kHz, 5 V amplitude sine wave and run a transient solution with a stop time of 2m </w:t>
-      </w:r>
-      <w:proofErr w:type="gramStart"/>
-      <w:r>
-        <w:rPr>
-          <w:rFonts w:cstheme="minorHAnsi"/>
-        </w:rPr>
-        <w:t>(.</w:t>
-      </w:r>
-      <w:proofErr w:type="spellStart"/>
-      <w:r>
-        <w:rPr>
-          <w:rFonts w:cstheme="minorHAnsi"/>
-        </w:rPr>
-        <w:t>tran</w:t>
-      </w:r>
-      <w:proofErr w:type="spellEnd"/>
-      <w:proofErr w:type="gramEnd"/>
-      <w:r>
-        <w:rPr>
-          <w:rFonts w:cstheme="minorHAnsi"/>
-        </w:rPr>
-        <w:t xml:space="preserve"> 2m). Plot the input voltage and the current through each diode.</w:t>
+        <w:t>Circuit in Figure 7.5. Power the LM393 with ±5 V. Set the input voltage to a 1 kHz, 5 V amplitude sine wave and run a transient solution with a stop time of 2m (.tran 2m). Plot the input voltage and the current through each diode.</w:t>
       </w:r>
     </w:p>
     <w:p>
@@ -2799,6 +2283,7 @@
       <w:r>
         <w:rPr>
           <w:rFonts w:ascii="Times New Roman" w:hAnsi="Times New Roman" w:cs="Times New Roman"/>
+          <w:noProof/>
           <w:sz w:val="28"/>
           <w:szCs w:val="28"/>
         </w:rPr>
@@ -2864,6 +2349,9 @@
         <w:t>8</w:t>
       </w:r>
       <w:r>
+        <w:rPr>
+          <w:noProof/>
+        </w:rPr>
         <w:fldChar w:fldCharType="end"/>
       </w:r>
       <w:r>
@@ -2883,10 +2371,10 @@
       </w:pPr>
       <w:r>
         <w:drawing>
-          <wp:inline distT="0" distB="0" distL="0" distR="0" wp14:anchorId="50E5FAFE" wp14:editId="0706B205">
+          <wp:inline distT="0" distB="0" distL="0" distR="0" wp14:anchorId="2730BFD7" wp14:editId="1257C458">
             <wp:extent cx="6949440" cy="3907790"/>
             <wp:effectExtent l="0" t="0" r="3810" b="0"/>
-            <wp:docPr id="23434137" name="Picture 1"/>
+            <wp:docPr id="89701292" name="Picture 1"/>
             <wp:cNvGraphicFramePr>
               <a:graphicFrameLocks xmlns:a="http://schemas.openxmlformats.org/drawingml/2006/main" noChangeAspect="1"/>
             </wp:cNvGraphicFramePr>
@@ -2894,7 +2382,7 @@
               <a:graphicData uri="http://schemas.openxmlformats.org/drawingml/2006/picture">
                 <pic:pic xmlns:pic="http://schemas.openxmlformats.org/drawingml/2006/picture">
                   <pic:nvPicPr>
-                    <pic:cNvPr id="23434137" name=""/>
+                    <pic:cNvPr id="89701292" name=""/>
                     <pic:cNvPicPr/>
                   </pic:nvPicPr>
                   <pic:blipFill>
@@ -2937,6 +2425,9 @@
         <w:t>5</w:t>
       </w:r>
       <w:r>
+        <w:rPr>
+          <w:noProof/>
+        </w:rPr>
         <w:fldChar w:fldCharType="end"/>
       </w:r>
       <w:r>
@@ -2946,13 +2437,7 @@
         <w:rPr>
           <w:rFonts w:cstheme="minorHAnsi"/>
         </w:rPr>
-        <w:t>Circuit</w:t>
-      </w:r>
-      <w:r>
-        <w:rPr>
-          <w:rFonts w:cstheme="minorHAnsi"/>
-        </w:rPr>
-        <w:t xml:space="preserve"> in Figure 7.8. Power the LM393 and TLV272 with ±5 V. Set the input voltage to a 1kHz, 0.1 V amplitude sine wave and run a transient solution with a stop time of 2m. Plot the input voltage, output of the op amp, positive and negative inputs to the comparator, and the current through both LEDs. </w:t>
+        <w:t xml:space="preserve">Circuit in Figure 7.8. Power the LM393 and TLV272 with ±5 V. Set the input voltage to a 1kHz, 0.1 V amplitude sine wave and run a transient solution with a stop time of 2m. Plot the input voltage, output of the op amp, positive and negative inputs to the comparator, and the current through both LEDs. </w:t>
       </w:r>
     </w:p>
     <w:p>
@@ -3085,6 +2570,114 @@
     </w:p>
     <w:p>
       <w:pPr>
+        <w:keepNext/>
+        <w:spacing w:before="120" w:line="240" w:lineRule="auto"/>
+        <w:jc w:val="center"/>
+      </w:pPr>
+      <w:r>
+        <w:rPr>
+          <w:rFonts w:ascii="Times New Roman" w:hAnsi="Times New Roman" w:cs="Times New Roman"/>
+          <w:sz w:val="28"/>
+          <w:szCs w:val="28"/>
+        </w:rPr>
+        <w:drawing>
+          <wp:inline distT="0" distB="0" distL="0" distR="0" wp14:anchorId="5543BFAB" wp14:editId="0CFADA28">
+            <wp:extent cx="6949440" cy="3907790"/>
+            <wp:effectExtent l="0" t="0" r="3810" b="0"/>
+            <wp:docPr id="1601404520" name="Picture 1"/>
+            <wp:cNvGraphicFramePr>
+              <a:graphicFrameLocks xmlns:a="http://schemas.openxmlformats.org/drawingml/2006/main" noChangeAspect="1"/>
+            </wp:cNvGraphicFramePr>
+            <a:graphic xmlns:a="http://schemas.openxmlformats.org/drawingml/2006/main">
+              <a:graphicData uri="http://schemas.openxmlformats.org/drawingml/2006/picture">
+                <pic:pic xmlns:pic="http://schemas.openxmlformats.org/drawingml/2006/picture">
+                  <pic:nvPicPr>
+                    <pic:cNvPr id="1601404520" name=""/>
+                    <pic:cNvPicPr/>
+                  </pic:nvPicPr>
+                  <pic:blipFill>
+                    <a:blip r:embed="rId23"/>
+                    <a:stretch>
+                      <a:fillRect/>
+                    </a:stretch>
+                  </pic:blipFill>
+                  <pic:spPr>
+                    <a:xfrm>
+                      <a:off x="0" y="0"/>
+                      <a:ext cx="6949440" cy="3907790"/>
+                    </a:xfrm>
+                    <a:prstGeom prst="rect">
+                      <a:avLst/>
+                    </a:prstGeom>
+                  </pic:spPr>
+                </pic:pic>
+              </a:graphicData>
+            </a:graphic>
+          </wp:inline>
+        </w:drawing>
+      </w:r>
+    </w:p>
+    <w:p>
+      <w:pPr>
+        <w:pStyle w:val="Caption"/>
+        <w:jc w:val="center"/>
+        <w:rPr>
+          <w:rFonts w:ascii="Times New Roman" w:hAnsi="Times New Roman" w:cs="Times New Roman"/>
+          <w:sz w:val="28"/>
+          <w:szCs w:val="28"/>
+        </w:rPr>
+      </w:pPr>
+      <w:r>
+        <w:t xml:space="preserve">Screenshot </w:t>
+      </w:r>
+      <w:r>
+        <w:fldChar w:fldCharType="begin"/>
+      </w:r>
+      <w:r>
+        <w:instrText xml:space="preserve"> SEQ Screenshot \* ARABIC </w:instrText>
+      </w:r>
+      <w:r>
+        <w:fldChar w:fldCharType="separate"/>
+      </w:r>
+      <w:r>
+        <w:rPr>
+          <w:noProof/>
+        </w:rPr>
+        <w:t>6</w:t>
+      </w:r>
+      <w:r>
+        <w:fldChar w:fldCharType="end"/>
+      </w:r>
+      <w:r>
+        <w:t xml:space="preserve">: </w:t>
+      </w:r>
+      <w:r>
+        <w:rPr>
+          <w:rFonts w:cstheme="minorHAnsi"/>
+        </w:rPr>
+        <w:t>C</w:t>
+      </w:r>
+      <w:r>
+        <w:rPr>
+          <w:rFonts w:cstheme="minorHAnsi"/>
+        </w:rPr>
+        <w:t>ircuit in Figure 7.5 on a breadboard</w:t>
+      </w:r>
+      <w:r>
+        <w:rPr>
+          <w:rFonts w:cstheme="minorHAnsi"/>
+        </w:rPr>
+        <w:t xml:space="preserve">. </w:t>
+      </w:r>
+      <w:r>
+        <w:rPr>
+          <w:rFonts w:cstheme="minorHAnsi"/>
+        </w:rPr>
+        <w:t>Set the input to a 0.5 Hz, 5 V amplitude sine wave.</w:t>
+      </w:r>
+    </w:p>
+    <w:p>
+      <w:pPr>
         <w:pStyle w:val="Heading3"/>
         <w:numPr>
           <w:ilvl w:val="2"/>
@@ -3221,6 +2814,7 @@
           <w:sz w:val="28"/>
           <w:szCs w:val="28"/>
         </w:rPr>
+        <w:lastRenderedPageBreak/>
         <w:t>Item 3: Full-wave rectifier, image of the circuit and plot of the input and output voltage.</w:t>
       </w:r>
     </w:p>
@@ -3371,6 +2965,198 @@
     </w:p>
     <w:p>
       <w:pPr>
+        <w:keepNext/>
+        <w:spacing w:before="120" w:line="240" w:lineRule="auto"/>
+        <w:jc w:val="center"/>
+      </w:pPr>
+      <w:r>
+        <w:rPr>
+          <w:rFonts w:ascii="Times New Roman" w:hAnsi="Times New Roman" w:cs="Times New Roman"/>
+          <w:noProof/>
+          <w:sz w:val="28"/>
+          <w:szCs w:val="28"/>
+        </w:rPr>
+        <w:drawing>
+          <wp:inline distT="0" distB="0" distL="0" distR="0" wp14:anchorId="25D97614" wp14:editId="5D95B2FB">
+            <wp:extent cx="6949440" cy="3907790"/>
+            <wp:effectExtent l="0" t="0" r="3810" b="0"/>
+            <wp:docPr id="1535993519" name="Picture 1"/>
+            <wp:cNvGraphicFramePr>
+              <a:graphicFrameLocks xmlns:a="http://schemas.openxmlformats.org/drawingml/2006/main" noChangeAspect="1"/>
+            </wp:cNvGraphicFramePr>
+            <a:graphic xmlns:a="http://schemas.openxmlformats.org/drawingml/2006/main">
+              <a:graphicData uri="http://schemas.openxmlformats.org/drawingml/2006/picture">
+                <pic:pic xmlns:pic="http://schemas.openxmlformats.org/drawingml/2006/picture">
+                  <pic:nvPicPr>
+                    <pic:cNvPr id="1535993519" name=""/>
+                    <pic:cNvPicPr/>
+                  </pic:nvPicPr>
+                  <pic:blipFill>
+                    <a:blip r:embed="rId24"/>
+                    <a:stretch>
+                      <a:fillRect/>
+                    </a:stretch>
+                  </pic:blipFill>
+                  <pic:spPr>
+                    <a:xfrm>
+                      <a:off x="0" y="0"/>
+                      <a:ext cx="6949440" cy="3907790"/>
+                    </a:xfrm>
+                    <a:prstGeom prst="rect">
+                      <a:avLst/>
+                    </a:prstGeom>
+                  </pic:spPr>
+                </pic:pic>
+              </a:graphicData>
+            </a:graphic>
+          </wp:inline>
+        </w:drawing>
+      </w:r>
+    </w:p>
+    <w:p>
+      <w:pPr>
+        <w:pStyle w:val="Caption"/>
+        <w:jc w:val="center"/>
+        <w:rPr>
+          <w:rFonts w:ascii="Times New Roman" w:hAnsi="Times New Roman" w:cs="Times New Roman"/>
+          <w:sz w:val="28"/>
+          <w:szCs w:val="28"/>
+        </w:rPr>
+      </w:pPr>
+      <w:r>
+        <w:t xml:space="preserve">Screenshot </w:t>
+      </w:r>
+      <w:r>
+        <w:fldChar w:fldCharType="begin"/>
+      </w:r>
+      <w:r>
+        <w:instrText xml:space="preserve"> SEQ Screenshot \* ARABIC </w:instrText>
+      </w:r>
+      <w:r>
+        <w:fldChar w:fldCharType="separate"/>
+      </w:r>
+      <w:r>
+        <w:rPr>
+          <w:noProof/>
+        </w:rPr>
+        <w:t>7</w:t>
+      </w:r>
+      <w:r>
+        <w:rPr>
+          <w:noProof/>
+        </w:rPr>
+        <w:fldChar w:fldCharType="end"/>
+      </w:r>
+      <w:r>
+        <w:t xml:space="preserve">: </w:t>
+      </w:r>
+      <w:r>
+        <w:t xml:space="preserve">Figure 7.5 Breadboarded. CH1+ is the input, CH2+ is </w:t>
+      </w:r>
+      <w:r>
+        <w:t>OutA</w:t>
+      </w:r>
+    </w:p>
+    <w:p>
+      <w:pPr>
+        <w:keepNext/>
+        <w:spacing w:before="120" w:line="240" w:lineRule="auto"/>
+        <w:jc w:val="center"/>
+      </w:pPr>
+      <w:r>
+        <w:rPr>
+          <w:noProof/>
+        </w:rPr>
+        <w:lastRenderedPageBreak/>
+        <w:drawing>
+          <wp:inline distT="0" distB="0" distL="0" distR="0" wp14:anchorId="2C4DA2DC" wp14:editId="50C84A6E">
+            <wp:extent cx="6949440" cy="3907790"/>
+            <wp:effectExtent l="0" t="0" r="3810" b="0"/>
+            <wp:docPr id="38286627" name="Picture 1"/>
+            <wp:cNvGraphicFramePr>
+              <a:graphicFrameLocks xmlns:a="http://schemas.openxmlformats.org/drawingml/2006/main" noChangeAspect="1"/>
+            </wp:cNvGraphicFramePr>
+            <a:graphic xmlns:a="http://schemas.openxmlformats.org/drawingml/2006/main">
+              <a:graphicData uri="http://schemas.openxmlformats.org/drawingml/2006/picture">
+                <pic:pic xmlns:pic="http://schemas.openxmlformats.org/drawingml/2006/picture">
+                  <pic:nvPicPr>
+                    <pic:cNvPr id="38286627" name=""/>
+                    <pic:cNvPicPr/>
+                  </pic:nvPicPr>
+                  <pic:blipFill>
+                    <a:blip r:embed="rId25"/>
+                    <a:stretch>
+                      <a:fillRect/>
+                    </a:stretch>
+                  </pic:blipFill>
+                  <pic:spPr>
+                    <a:xfrm>
+                      <a:off x="0" y="0"/>
+                      <a:ext cx="6949440" cy="3907790"/>
+                    </a:xfrm>
+                    <a:prstGeom prst="rect">
+                      <a:avLst/>
+                    </a:prstGeom>
+                  </pic:spPr>
+                </pic:pic>
+              </a:graphicData>
+            </a:graphic>
+          </wp:inline>
+        </w:drawing>
+      </w:r>
+    </w:p>
+    <w:p>
+      <w:pPr>
+        <w:pStyle w:val="Caption"/>
+        <w:jc w:val="center"/>
+        <w:rPr>
+          <w:rFonts w:ascii="Times New Roman" w:hAnsi="Times New Roman" w:cs="Times New Roman"/>
+          <w:sz w:val="28"/>
+          <w:szCs w:val="28"/>
+        </w:rPr>
+      </w:pPr>
+      <w:r>
+        <w:t xml:space="preserve">Screenshot </w:t>
+      </w:r>
+      <w:r>
+        <w:fldChar w:fldCharType="begin"/>
+      </w:r>
+      <w:r>
+        <w:instrText xml:space="preserve"> SEQ Screenshot \* ARABIC </w:instrText>
+      </w:r>
+      <w:r>
+        <w:fldChar w:fldCharType="separate"/>
+      </w:r>
+      <w:r>
+        <w:rPr>
+          <w:noProof/>
+        </w:rPr>
+        <w:t>8</w:t>
+      </w:r>
+      <w:r>
+        <w:rPr>
+          <w:noProof/>
+        </w:rPr>
+        <w:fldChar w:fldCharType="end"/>
+      </w:r>
+      <w:r>
+        <w:t>:</w:t>
+      </w:r>
+      <w:r>
+        <w:t xml:space="preserve"> </w:t>
+      </w:r>
+      <w:r>
+        <w:t>Figure 7.5 Breadboarded. CH1+ is the input, CH2+ is</w:t>
+      </w:r>
+      <w:r>
+        <w:t xml:space="preserve"> Out</w:t>
+      </w:r>
+      <w:r>
+        <w:t>B</w:t>
+      </w:r>
+    </w:p>
+    <w:p>
+      <w:pPr>
         <w:pStyle w:val="ListParagraph"/>
         <w:numPr>
           <w:ilvl w:val="0"/>
@@ -3394,6 +3180,98 @@
     </w:p>
     <w:p>
       <w:pPr>
+        <w:keepNext/>
+        <w:spacing w:before="120" w:line="240" w:lineRule="auto"/>
+        <w:jc w:val="center"/>
+      </w:pPr>
+      <w:r>
+        <w:rPr>
+          <w:rFonts w:ascii="Times New Roman" w:hAnsi="Times New Roman" w:cs="Times New Roman"/>
+          <w:noProof/>
+          <w:sz w:val="28"/>
+          <w:szCs w:val="28"/>
+        </w:rPr>
+        <w:lastRenderedPageBreak/>
+        <w:drawing>
+          <wp:inline distT="0" distB="0" distL="0" distR="0" wp14:anchorId="18532542" wp14:editId="0086C081">
+            <wp:extent cx="6949440" cy="3907790"/>
+            <wp:effectExtent l="0" t="0" r="3810" b="0"/>
+            <wp:docPr id="624492733" name="Picture 1"/>
+            <wp:cNvGraphicFramePr>
+              <a:graphicFrameLocks xmlns:a="http://schemas.openxmlformats.org/drawingml/2006/main" noChangeAspect="1"/>
+            </wp:cNvGraphicFramePr>
+            <a:graphic xmlns:a="http://schemas.openxmlformats.org/drawingml/2006/main">
+              <a:graphicData uri="http://schemas.openxmlformats.org/drawingml/2006/picture">
+                <pic:pic xmlns:pic="http://schemas.openxmlformats.org/drawingml/2006/picture">
+                  <pic:nvPicPr>
+                    <pic:cNvPr id="624492733" name=""/>
+                    <pic:cNvPicPr/>
+                  </pic:nvPicPr>
+                  <pic:blipFill>
+                    <a:blip r:embed="rId26"/>
+                    <a:stretch>
+                      <a:fillRect/>
+                    </a:stretch>
+                  </pic:blipFill>
+                  <pic:spPr>
+                    <a:xfrm>
+                      <a:off x="0" y="0"/>
+                      <a:ext cx="6949440" cy="3907790"/>
+                    </a:xfrm>
+                    <a:prstGeom prst="rect">
+                      <a:avLst/>
+                    </a:prstGeom>
+                  </pic:spPr>
+                </pic:pic>
+              </a:graphicData>
+            </a:graphic>
+          </wp:inline>
+        </w:drawing>
+      </w:r>
+    </w:p>
+    <w:p>
+      <w:pPr>
+        <w:pStyle w:val="Caption"/>
+        <w:jc w:val="center"/>
+        <w:rPr>
+          <w:rFonts w:ascii="Times New Roman" w:hAnsi="Times New Roman" w:cs="Times New Roman"/>
+          <w:sz w:val="28"/>
+          <w:szCs w:val="28"/>
+        </w:rPr>
+      </w:pPr>
+      <w:r>
+        <w:t xml:space="preserve">Screenshot </w:t>
+      </w:r>
+      <w:r>
+        <w:fldChar w:fldCharType="begin"/>
+      </w:r>
+      <w:r>
+        <w:instrText xml:space="preserve"> SEQ Screenshot \* ARABIC </w:instrText>
+      </w:r>
+      <w:r>
+        <w:fldChar w:fldCharType="separate"/>
+      </w:r>
+      <w:r>
+        <w:rPr>
+          <w:noProof/>
+        </w:rPr>
+        <w:t>9</w:t>
+      </w:r>
+      <w:r>
+        <w:fldChar w:fldCharType="end"/>
+      </w:r>
+      <w:r>
+        <w:t>: C</w:t>
+      </w:r>
+      <w:r>
+        <w:t>ircuit from Section 8.5.1 - Item 1</w:t>
+      </w:r>
+      <w:r>
+        <w:t>, CH1+ is the input, CH2+ is the output.</w:t>
+      </w:r>
+    </w:p>
+    <w:p>
+      <w:pPr>
         <w:pStyle w:val="ListParagraph"/>
         <w:numPr>
           <w:ilvl w:val="0"/>
@@ -3412,61 +3290,195 @@
           <w:sz w:val="28"/>
           <w:szCs w:val="28"/>
         </w:rPr>
-        <w:t xml:space="preserve">Build two versions of the circuit from Subsection 8.5.1 - Item 2, one with where the 8 capacitance is 0.1 </w:t>
-      </w:r>
-      <w:proofErr w:type="spellStart"/>
-      <w:r>
-        <w:rPr>
-          <w:rFonts w:ascii="Times New Roman" w:hAnsi="Times New Roman" w:cs="Times New Roman"/>
-          <w:sz w:val="28"/>
-          <w:szCs w:val="28"/>
-        </w:rPr>
-        <w:t>uF</w:t>
-      </w:r>
-      <w:proofErr w:type="spellEnd"/>
-      <w:r>
-        <w:rPr>
-          <w:rFonts w:ascii="Times New Roman" w:hAnsi="Times New Roman" w:cs="Times New Roman"/>
-          <w:sz w:val="28"/>
-          <w:szCs w:val="28"/>
-        </w:rPr>
-        <w:t xml:space="preserve"> and the other is 0.01 </w:t>
-      </w:r>
-      <w:proofErr w:type="spellStart"/>
-      <w:r>
-        <w:rPr>
-          <w:rFonts w:ascii="Times New Roman" w:hAnsi="Times New Roman" w:cs="Times New Roman"/>
-          <w:sz w:val="28"/>
-          <w:szCs w:val="28"/>
-        </w:rPr>
-        <w:t>uF</w:t>
-      </w:r>
-      <w:proofErr w:type="spellEnd"/>
-      <w:r>
-        <w:rPr>
-          <w:rFonts w:ascii="Times New Roman" w:hAnsi="Times New Roman" w:cs="Times New Roman"/>
-          <w:sz w:val="28"/>
-          <w:szCs w:val="28"/>
-        </w:rPr>
-        <w:t xml:space="preserve">. Plot the outputs of both circuits on the </w:t>
-      </w:r>
-      <w:proofErr w:type="spellStart"/>
-      <w:r>
-        <w:rPr>
-          <w:rFonts w:ascii="Times New Roman" w:hAnsi="Times New Roman" w:cs="Times New Roman"/>
-          <w:sz w:val="28"/>
-          <w:szCs w:val="28"/>
-        </w:rPr>
-        <w:t>oscope</w:t>
-      </w:r>
-      <w:proofErr w:type="spellEnd"/>
-      <w:r>
-        <w:rPr>
-          <w:rFonts w:ascii="Times New Roman" w:hAnsi="Times New Roman" w:cs="Times New Roman"/>
-          <w:sz w:val="28"/>
-          <w:szCs w:val="28"/>
-        </w:rPr>
-        <w:t xml:space="preserve"> and save an image of the display.</w:t>
+        <w:t>Build two versions of the circuit from Subsection 8.5.1 - Item 2, one with where the 8 capacitance is 0.1 uF and the other is 0.01 uF. Plot the outputs of both circuits on the oscope and save an image of the display.</w:t>
+      </w:r>
+    </w:p>
+    <w:p>
+      <w:pPr>
+        <w:keepNext/>
+        <w:spacing w:before="120" w:line="240" w:lineRule="auto"/>
+        <w:ind w:left="432"/>
+        <w:jc w:val="center"/>
+      </w:pPr>
+      <w:r>
+        <w:rPr>
+          <w:rFonts w:ascii="Times New Roman" w:hAnsi="Times New Roman" w:cs="Times New Roman"/>
+          <w:noProof/>
+          <w:sz w:val="28"/>
+          <w:szCs w:val="28"/>
+        </w:rPr>
+        <w:lastRenderedPageBreak/>
+        <w:drawing>
+          <wp:inline distT="0" distB="0" distL="0" distR="0" wp14:anchorId="79DB3240" wp14:editId="3A5B60AA">
+            <wp:extent cx="6949440" cy="3907790"/>
+            <wp:effectExtent l="0" t="0" r="3810" b="0"/>
+            <wp:docPr id="1082239100" name="Picture 1"/>
+            <wp:cNvGraphicFramePr>
+              <a:graphicFrameLocks xmlns:a="http://schemas.openxmlformats.org/drawingml/2006/main" noChangeAspect="1"/>
+            </wp:cNvGraphicFramePr>
+            <a:graphic xmlns:a="http://schemas.openxmlformats.org/drawingml/2006/main">
+              <a:graphicData uri="http://schemas.openxmlformats.org/drawingml/2006/picture">
+                <pic:pic xmlns:pic="http://schemas.openxmlformats.org/drawingml/2006/picture">
+                  <pic:nvPicPr>
+                    <pic:cNvPr id="1082239100" name=""/>
+                    <pic:cNvPicPr/>
+                  </pic:nvPicPr>
+                  <pic:blipFill>
+                    <a:blip r:embed="rId27"/>
+                    <a:stretch>
+                      <a:fillRect/>
+                    </a:stretch>
+                  </pic:blipFill>
+                  <pic:spPr>
+                    <a:xfrm>
+                      <a:off x="0" y="0"/>
+                      <a:ext cx="6949440" cy="3907790"/>
+                    </a:xfrm>
+                    <a:prstGeom prst="rect">
+                      <a:avLst/>
+                    </a:prstGeom>
+                  </pic:spPr>
+                </pic:pic>
+              </a:graphicData>
+            </a:graphic>
+          </wp:inline>
+        </w:drawing>
+      </w:r>
+    </w:p>
+    <w:p>
+      <w:pPr>
+        <w:pStyle w:val="Caption"/>
+        <w:jc w:val="center"/>
+        <w:rPr>
+          <w:rFonts w:ascii="Times New Roman" w:hAnsi="Times New Roman" w:cs="Times New Roman"/>
+          <w:sz w:val="28"/>
+          <w:szCs w:val="28"/>
+        </w:rPr>
+      </w:pPr>
+      <w:r>
+        <w:t xml:space="preserve">Screenshot </w:t>
+      </w:r>
+      <w:r>
+        <w:fldChar w:fldCharType="begin"/>
+      </w:r>
+      <w:r>
+        <w:instrText xml:space="preserve"> SEQ Screenshot \* ARABIC </w:instrText>
+      </w:r>
+      <w:r>
+        <w:fldChar w:fldCharType="separate"/>
+      </w:r>
+      <w:r>
+        <w:rPr>
+          <w:noProof/>
+        </w:rPr>
+        <w:t>10</w:t>
+      </w:r>
+      <w:r>
+        <w:fldChar w:fldCharType="end"/>
+      </w:r>
+      <w:r>
+        <w:t>: C</w:t>
+      </w:r>
+      <w:r>
+        <w:t>ircuit from Subsection 8.5.1 - Item 2</w:t>
+      </w:r>
+      <w:r>
+        <w:t>. With capacitance of</w:t>
+      </w:r>
+      <w:r>
+        <w:t xml:space="preserve"> 0.01 uF</w:t>
+      </w:r>
+    </w:p>
+    <w:p>
+      <w:pPr>
+        <w:keepNext/>
+        <w:spacing w:before="120" w:line="240" w:lineRule="auto"/>
+        <w:ind w:left="432"/>
+        <w:jc w:val="center"/>
+      </w:pPr>
+      <w:r>
+        <w:rPr>
+          <w:rFonts w:ascii="Times New Roman" w:hAnsi="Times New Roman" w:cs="Times New Roman"/>
+          <w:noProof/>
+          <w:sz w:val="28"/>
+          <w:szCs w:val="28"/>
+        </w:rPr>
+        <w:drawing>
+          <wp:inline distT="0" distB="0" distL="0" distR="0" wp14:anchorId="4438A04E" wp14:editId="2430751A">
+            <wp:extent cx="6949440" cy="3907790"/>
+            <wp:effectExtent l="0" t="0" r="3810" b="0"/>
+            <wp:docPr id="1257917531" name="Picture 1"/>
+            <wp:cNvGraphicFramePr>
+              <a:graphicFrameLocks xmlns:a="http://schemas.openxmlformats.org/drawingml/2006/main" noChangeAspect="1"/>
+            </wp:cNvGraphicFramePr>
+            <a:graphic xmlns:a="http://schemas.openxmlformats.org/drawingml/2006/main">
+              <a:graphicData uri="http://schemas.openxmlformats.org/drawingml/2006/picture">
+                <pic:pic xmlns:pic="http://schemas.openxmlformats.org/drawingml/2006/picture">
+                  <pic:nvPicPr>
+                    <pic:cNvPr id="1257917531" name=""/>
+                    <pic:cNvPicPr/>
+                  </pic:nvPicPr>
+                  <pic:blipFill>
+                    <a:blip r:embed="rId28"/>
+                    <a:stretch>
+                      <a:fillRect/>
+                    </a:stretch>
+                  </pic:blipFill>
+                  <pic:spPr>
+                    <a:xfrm>
+                      <a:off x="0" y="0"/>
+                      <a:ext cx="6949440" cy="3907790"/>
+                    </a:xfrm>
+                    <a:prstGeom prst="rect">
+                      <a:avLst/>
+                    </a:prstGeom>
+                  </pic:spPr>
+                </pic:pic>
+              </a:graphicData>
+            </a:graphic>
+          </wp:inline>
+        </w:drawing>
+      </w:r>
+    </w:p>
+    <w:p>
+      <w:pPr>
+        <w:pStyle w:val="Caption"/>
+        <w:jc w:val="center"/>
+        <w:rPr>
+          <w:rFonts w:ascii="Times New Roman" w:hAnsi="Times New Roman" w:cs="Times New Roman"/>
+          <w:sz w:val="28"/>
+          <w:szCs w:val="28"/>
+        </w:rPr>
+      </w:pPr>
+      <w:r>
+        <w:t xml:space="preserve">Screenshot </w:t>
+      </w:r>
+      <w:r>
+        <w:fldChar w:fldCharType="begin"/>
+      </w:r>
+      <w:r>
+        <w:instrText xml:space="preserve"> SEQ Screenshot \* ARABIC </w:instrText>
+      </w:r>
+      <w:r>
+        <w:fldChar w:fldCharType="separate"/>
+      </w:r>
+      <w:r>
+        <w:rPr>
+          <w:noProof/>
+        </w:rPr>
+        <w:t>11</w:t>
+      </w:r>
+      <w:r>
+        <w:fldChar w:fldCharType="end"/>
+      </w:r>
+      <w:r>
+        <w:t xml:space="preserve">: </w:t>
+      </w:r>
+      <w:r>
+        <w:t>Circuit from Subsection 8.5.1 - Item 2. With capacitance of</w:t>
+      </w:r>
+      <w:r>
+        <w:t xml:space="preserve"> 0.1 uF</w:t>
       </w:r>
     </w:p>
     <w:p>
@@ -3489,79 +3501,96 @@
           <w:sz w:val="28"/>
           <w:szCs w:val="28"/>
         </w:rPr>
-        <w:t xml:space="preserve">Implement the full-bridge circuit from Subsection 8.5.1 - Item 3. Set </w:t>
-      </w:r>
-      <w:proofErr w:type="spellStart"/>
-      <w:r>
-        <w:rPr>
-          <w:rFonts w:ascii="Times New Roman" w:hAnsi="Times New Roman" w:cs="Times New Roman"/>
-          <w:sz w:val="28"/>
-          <w:szCs w:val="28"/>
-        </w:rPr>
-        <w:t>Wavegen</w:t>
-      </w:r>
-      <w:proofErr w:type="spellEnd"/>
-      <w:r>
-        <w:rPr>
-          <w:rFonts w:ascii="Times New Roman" w:hAnsi="Times New Roman" w:cs="Times New Roman"/>
-          <w:sz w:val="28"/>
-          <w:szCs w:val="28"/>
-        </w:rPr>
-        <w:t xml:space="preserve"> 1 to a 200 Hz, 5 V amplitude sine wave. When measuring the output, connect Scope 2+ to </w:t>
-      </w:r>
-      <w:proofErr w:type="spellStart"/>
-      <w:r>
-        <w:rPr>
-          <w:rFonts w:ascii="Times New Roman" w:hAnsi="Times New Roman" w:cs="Times New Roman"/>
-          <w:sz w:val="28"/>
-          <w:szCs w:val="28"/>
-        </w:rPr>
-        <w:t>Vout</w:t>
-      </w:r>
-      <w:proofErr w:type="spellEnd"/>
-      <w:r>
-        <w:rPr>
-          <w:rFonts w:ascii="Times New Roman" w:hAnsi="Times New Roman" w:cs="Times New Roman"/>
-          <w:sz w:val="28"/>
-          <w:szCs w:val="28"/>
-        </w:rPr>
-        <w:t xml:space="preserve">+ and Scope 2- to </w:t>
-      </w:r>
-      <w:proofErr w:type="spellStart"/>
-      <w:r>
-        <w:rPr>
-          <w:rFonts w:ascii="Times New Roman" w:hAnsi="Times New Roman" w:cs="Times New Roman"/>
-          <w:sz w:val="28"/>
-          <w:szCs w:val="28"/>
-        </w:rPr>
-        <w:t>Vout</w:t>
-      </w:r>
-      <w:proofErr w:type="spellEnd"/>
-      <w:r>
-        <w:rPr>
-          <w:rFonts w:ascii="Times New Roman" w:hAnsi="Times New Roman" w:cs="Times New Roman"/>
-          <w:sz w:val="28"/>
-          <w:szCs w:val="28"/>
-        </w:rPr>
-        <w:t xml:space="preserve">- to get the differential signal. Plot the outputs of both circuits on the </w:t>
-      </w:r>
-      <w:proofErr w:type="spellStart"/>
-      <w:r>
-        <w:rPr>
-          <w:rFonts w:ascii="Times New Roman" w:hAnsi="Times New Roman" w:cs="Times New Roman"/>
-          <w:sz w:val="28"/>
-          <w:szCs w:val="28"/>
-        </w:rPr>
-        <w:t>oscope</w:t>
-      </w:r>
-      <w:proofErr w:type="spellEnd"/>
-      <w:r>
-        <w:rPr>
-          <w:rFonts w:ascii="Times New Roman" w:hAnsi="Times New Roman" w:cs="Times New Roman"/>
-          <w:sz w:val="28"/>
-          <w:szCs w:val="28"/>
-        </w:rPr>
-        <w:t xml:space="preserve"> and save an image of the display.</w:t>
+        <w:lastRenderedPageBreak/>
+        <w:t>Implement the full-bridge circuit from Subsection 8.5.1 - Item 3. Set Wavegen 1 to a 200 Hz, 5 V amplitude sine wave. When measuring the output, connect Scope 2+ to Vout+ and Scope 2- to Vout- to get the differential signal. Plot the outputs of both circuits on the oscope and save an image of the display.</w:t>
+      </w:r>
+    </w:p>
+    <w:p>
+      <w:pPr>
+        <w:keepNext/>
+        <w:spacing w:before="120" w:line="240" w:lineRule="auto"/>
+        <w:jc w:val="center"/>
+      </w:pPr>
+      <w:r>
+        <w:rPr>
+          <w:rFonts w:ascii="Times New Roman" w:hAnsi="Times New Roman" w:cs="Times New Roman"/>
+          <w:noProof/>
+          <w:sz w:val="28"/>
+          <w:szCs w:val="28"/>
+        </w:rPr>
+        <w:drawing>
+          <wp:inline distT="0" distB="0" distL="0" distR="0" wp14:anchorId="238889FB" wp14:editId="117146F2">
+            <wp:extent cx="6949440" cy="3907790"/>
+            <wp:effectExtent l="0" t="0" r="3810" b="0"/>
+            <wp:docPr id="2100114358" name="Picture 1"/>
+            <wp:cNvGraphicFramePr>
+              <a:graphicFrameLocks xmlns:a="http://schemas.openxmlformats.org/drawingml/2006/main" noChangeAspect="1"/>
+            </wp:cNvGraphicFramePr>
+            <a:graphic xmlns:a="http://schemas.openxmlformats.org/drawingml/2006/main">
+              <a:graphicData uri="http://schemas.openxmlformats.org/drawingml/2006/picture">
+                <pic:pic xmlns:pic="http://schemas.openxmlformats.org/drawingml/2006/picture">
+                  <pic:nvPicPr>
+                    <pic:cNvPr id="2100114358" name=""/>
+                    <pic:cNvPicPr/>
+                  </pic:nvPicPr>
+                  <pic:blipFill>
+                    <a:blip r:embed="rId29"/>
+                    <a:stretch>
+                      <a:fillRect/>
+                    </a:stretch>
+                  </pic:blipFill>
+                  <pic:spPr>
+                    <a:xfrm>
+                      <a:off x="0" y="0"/>
+                      <a:ext cx="6949440" cy="3907790"/>
+                    </a:xfrm>
+                    <a:prstGeom prst="rect">
+                      <a:avLst/>
+                    </a:prstGeom>
+                  </pic:spPr>
+                </pic:pic>
+              </a:graphicData>
+            </a:graphic>
+          </wp:inline>
+        </w:drawing>
+      </w:r>
+    </w:p>
+    <w:p>
+      <w:pPr>
+        <w:pStyle w:val="Caption"/>
+        <w:jc w:val="center"/>
+        <w:rPr>
+          <w:rFonts w:ascii="Times New Roman" w:hAnsi="Times New Roman" w:cs="Times New Roman"/>
+          <w:sz w:val="28"/>
+          <w:szCs w:val="28"/>
+        </w:rPr>
+      </w:pPr>
+      <w:r>
+        <w:t xml:space="preserve">Screenshot </w:t>
+      </w:r>
+      <w:r>
+        <w:fldChar w:fldCharType="begin"/>
+      </w:r>
+      <w:r>
+        <w:instrText xml:space="preserve"> SEQ Screenshot \* ARABIC </w:instrText>
+      </w:r>
+      <w:r>
+        <w:fldChar w:fldCharType="separate"/>
+      </w:r>
+      <w:r>
+        <w:rPr>
+          <w:noProof/>
+        </w:rPr>
+        <w:t>12</w:t>
+      </w:r>
+      <w:r>
+        <w:fldChar w:fldCharType="end"/>
+      </w:r>
+      <w:r>
+        <w:t>: F</w:t>
+      </w:r>
+      <w:r>
+        <w:t>ull-bridge circuit from Subsection 8.5.1 - Item 3. Set Wavegen 1 to a 200 Hz, 5 V amplitude sine wave. When measuring the output, connect Scope 2+ to Vout+ and Scope 2- to Vout- to get the differential signal.</w:t>
       </w:r>
     </w:p>
     <w:p>
@@ -3584,8 +3613,318 @@
           <w:sz w:val="28"/>
           <w:szCs w:val="28"/>
         </w:rPr>
+        <w:t xml:space="preserve">Build the circuit from Subsection 8.5.1 - Item 5. Set the input to a 0.5 Hz, 0.1 V amplitude sine wave. Vary the potentiometer, increase the gain, so that the LEDs illuminate when the op amp output is greater than the reference voltages. Plot the output of the gain amplifier and the output of either comparator on the o-scope and save an image of the display. </w:t>
+      </w:r>
+    </w:p>
+    <w:p>
+      <w:pPr>
+        <w:keepNext/>
+        <w:spacing w:before="120" w:line="240" w:lineRule="auto"/>
+        <w:jc w:val="center"/>
+      </w:pPr>
+      <w:r>
+        <w:rPr>
+          <w:rFonts w:ascii="Times New Roman" w:hAnsi="Times New Roman" w:cs="Times New Roman"/>
+          <w:sz w:val="28"/>
+          <w:szCs w:val="28"/>
+        </w:rPr>
         <w:lastRenderedPageBreak/>
-        <w:t xml:space="preserve">Build the circuit from Subsection 8.5.1 - Item 5. Set the input to a 0.5 Hz, 0.1 V amplitude sine wave. Vary the potentiometer, increase the gain, so that the LEDs illuminate when the op amp output is greater than the reference voltages. Plot the output of the gain amplifier and the output of either comparator on the o-scope and save an image of the display. </w:t>
+        <w:drawing>
+          <wp:inline distT="0" distB="0" distL="0" distR="0" wp14:anchorId="6FF6E1EC" wp14:editId="0F5ECAD6">
+            <wp:extent cx="6949440" cy="3907790"/>
+            <wp:effectExtent l="0" t="0" r="3810" b="0"/>
+            <wp:docPr id="97807407" name="Picture 1"/>
+            <wp:cNvGraphicFramePr>
+              <a:graphicFrameLocks xmlns:a="http://schemas.openxmlformats.org/drawingml/2006/main" noChangeAspect="1"/>
+            </wp:cNvGraphicFramePr>
+            <a:graphic xmlns:a="http://schemas.openxmlformats.org/drawingml/2006/main">
+              <a:graphicData uri="http://schemas.openxmlformats.org/drawingml/2006/picture">
+                <pic:pic xmlns:pic="http://schemas.openxmlformats.org/drawingml/2006/picture">
+                  <pic:nvPicPr>
+                    <pic:cNvPr id="97807407" name=""/>
+                    <pic:cNvPicPr/>
+                  </pic:nvPicPr>
+                  <pic:blipFill>
+                    <a:blip r:embed="rId30"/>
+                    <a:stretch>
+                      <a:fillRect/>
+                    </a:stretch>
+                  </pic:blipFill>
+                  <pic:spPr>
+                    <a:xfrm>
+                      <a:off x="0" y="0"/>
+                      <a:ext cx="6949440" cy="3907790"/>
+                    </a:xfrm>
+                    <a:prstGeom prst="rect">
+                      <a:avLst/>
+                    </a:prstGeom>
+                  </pic:spPr>
+                </pic:pic>
+              </a:graphicData>
+            </a:graphic>
+          </wp:inline>
+        </w:drawing>
+      </w:r>
+    </w:p>
+    <w:p>
+      <w:pPr>
+        <w:pStyle w:val="Caption"/>
+        <w:jc w:val="center"/>
+        <w:rPr>
+          <w:rFonts w:ascii="Times New Roman" w:hAnsi="Times New Roman" w:cs="Times New Roman"/>
+          <w:sz w:val="28"/>
+          <w:szCs w:val="28"/>
+        </w:rPr>
+      </w:pPr>
+      <w:r>
+        <w:t xml:space="preserve">Screenshot </w:t>
+      </w:r>
+      <w:r>
+        <w:fldChar w:fldCharType="begin"/>
+      </w:r>
+      <w:r>
+        <w:instrText xml:space="preserve"> SEQ Screenshot \* ARABIC </w:instrText>
+      </w:r>
+      <w:r>
+        <w:fldChar w:fldCharType="separate"/>
+      </w:r>
+      <w:r>
+        <w:rPr>
+          <w:noProof/>
+        </w:rPr>
+        <w:t>13</w:t>
+      </w:r>
+      <w:r>
+        <w:fldChar w:fldCharType="end"/>
+      </w:r>
+      <w:r>
+        <w:t xml:space="preserve">: </w:t>
+      </w:r>
+      <w:r>
+        <w:t>C</w:t>
+      </w:r>
+      <w:r>
+        <w:rPr>
+          <w:rFonts w:cstheme="minorHAnsi"/>
+        </w:rPr>
+        <w:t xml:space="preserve">ircuit from Subsection 8.5.1 - Item 5. Set the input to a 0.5 Hz, 0.1 V amplitude sine wave. </w:t>
+      </w:r>
+      <w:r>
+        <w:rPr>
+          <w:rFonts w:cstheme="minorHAnsi"/>
+        </w:rPr>
+        <w:t xml:space="preserve"> CH1+ is gain amplifier output, CH2+ is </w:t>
+      </w:r>
+      <w:r>
+        <w:rPr>
+          <w:rFonts w:cstheme="minorHAnsi"/>
+        </w:rPr>
+        <w:t>O</w:t>
+      </w:r>
+      <w:r>
+        <w:t>utA</w:t>
+      </w:r>
+      <w:r>
+        <w:t>.</w:t>
+      </w:r>
+    </w:p>
+    <w:p>
+      <w:pPr>
+        <w:keepNext/>
+        <w:spacing w:before="120" w:line="240" w:lineRule="auto"/>
+        <w:jc w:val="center"/>
+      </w:pPr>
+      <w:r>
+        <w:rPr>
+          <w:rFonts w:ascii="Times New Roman" w:hAnsi="Times New Roman" w:cs="Times New Roman"/>
+          <w:sz w:val="28"/>
+          <w:szCs w:val="28"/>
+        </w:rPr>
+        <w:drawing>
+          <wp:inline distT="0" distB="0" distL="0" distR="0" wp14:anchorId="558362C4" wp14:editId="471EF30C">
+            <wp:extent cx="6949440" cy="3907790"/>
+            <wp:effectExtent l="0" t="0" r="3810" b="0"/>
+            <wp:docPr id="616702652" name="Picture 1"/>
+            <wp:cNvGraphicFramePr>
+              <a:graphicFrameLocks xmlns:a="http://schemas.openxmlformats.org/drawingml/2006/main" noChangeAspect="1"/>
+            </wp:cNvGraphicFramePr>
+            <a:graphic xmlns:a="http://schemas.openxmlformats.org/drawingml/2006/main">
+              <a:graphicData uri="http://schemas.openxmlformats.org/drawingml/2006/picture">
+                <pic:pic xmlns:pic="http://schemas.openxmlformats.org/drawingml/2006/picture">
+                  <pic:nvPicPr>
+                    <pic:cNvPr id="616702652" name=""/>
+                    <pic:cNvPicPr/>
+                  </pic:nvPicPr>
+                  <pic:blipFill>
+                    <a:blip r:embed="rId31"/>
+                    <a:stretch>
+                      <a:fillRect/>
+                    </a:stretch>
+                  </pic:blipFill>
+                  <pic:spPr>
+                    <a:xfrm>
+                      <a:off x="0" y="0"/>
+                      <a:ext cx="6949440" cy="3907790"/>
+                    </a:xfrm>
+                    <a:prstGeom prst="rect">
+                      <a:avLst/>
+                    </a:prstGeom>
+                  </pic:spPr>
+                </pic:pic>
+              </a:graphicData>
+            </a:graphic>
+          </wp:inline>
+        </w:drawing>
+      </w:r>
+    </w:p>
+    <w:p>
+      <w:pPr>
+        <w:pStyle w:val="Caption"/>
+        <w:jc w:val="center"/>
+        <w:rPr>
+          <w:rFonts w:ascii="Times New Roman" w:hAnsi="Times New Roman" w:cs="Times New Roman"/>
+          <w:sz w:val="28"/>
+          <w:szCs w:val="28"/>
+        </w:rPr>
+      </w:pPr>
+      <w:r>
+        <w:t xml:space="preserve">Screenshot </w:t>
+      </w:r>
+      <w:r>
+        <w:fldChar w:fldCharType="begin"/>
+      </w:r>
+      <w:r>
+        <w:instrText xml:space="preserve"> SEQ Screenshot \* ARABIC </w:instrText>
+      </w:r>
+      <w:r>
+        <w:fldChar w:fldCharType="separate"/>
+      </w:r>
+      <w:r>
+        <w:rPr>
+          <w:noProof/>
+        </w:rPr>
+        <w:t>14</w:t>
+      </w:r>
+      <w:r>
+        <w:fldChar w:fldCharType="end"/>
+      </w:r>
+      <w:r>
+        <w:t>:</w:t>
+      </w:r>
+      <w:r>
+        <w:t xml:space="preserve"> C</w:t>
+      </w:r>
+      <w:r>
+        <w:rPr>
+          <w:rFonts w:cstheme="minorHAnsi"/>
+        </w:rPr>
+        <w:t xml:space="preserve">ircuit from Subsection 8.5.1 - Item 5. Set the input to a 0.5 Hz, 0.1 V amplitude sine wave. </w:t>
+      </w:r>
+      <w:r>
+        <w:rPr>
+          <w:rFonts w:cstheme="minorHAnsi"/>
+        </w:rPr>
+        <w:t xml:space="preserve"> CH1+ is gain amplifier output, CH2+ is </w:t>
+      </w:r>
+      <w:r>
+        <w:rPr>
+          <w:rFonts w:cstheme="minorHAnsi"/>
+        </w:rPr>
+        <w:t>O</w:t>
+      </w:r>
+      <w:r>
+        <w:t>ut</w:t>
+      </w:r>
+      <w:r>
+        <w:t>B</w:t>
+      </w:r>
+    </w:p>
+    <w:p>
+      <w:pPr>
+        <w:keepNext/>
+        <w:spacing w:before="120" w:line="240" w:lineRule="auto"/>
+        <w:jc w:val="center"/>
+      </w:pPr>
+      <w:r>
+        <w:rPr>
+          <w:rFonts w:ascii="Times New Roman" w:hAnsi="Times New Roman" w:cs="Times New Roman"/>
+          <w:sz w:val="28"/>
+          <w:szCs w:val="28"/>
+        </w:rPr>
+        <w:lastRenderedPageBreak/>
+        <w:drawing>
+          <wp:inline distT="0" distB="0" distL="0" distR="0" wp14:anchorId="2E35F613" wp14:editId="276DACFB">
+            <wp:extent cx="6949440" cy="3907790"/>
+            <wp:effectExtent l="0" t="0" r="3810" b="0"/>
+            <wp:docPr id="1219578193" name="Picture 1"/>
+            <wp:cNvGraphicFramePr>
+              <a:graphicFrameLocks xmlns:a="http://schemas.openxmlformats.org/drawingml/2006/main" noChangeAspect="1"/>
+            </wp:cNvGraphicFramePr>
+            <a:graphic xmlns:a="http://schemas.openxmlformats.org/drawingml/2006/main">
+              <a:graphicData uri="http://schemas.openxmlformats.org/drawingml/2006/picture">
+                <pic:pic xmlns:pic="http://schemas.openxmlformats.org/drawingml/2006/picture">
+                  <pic:nvPicPr>
+                    <pic:cNvPr id="1219578193" name=""/>
+                    <pic:cNvPicPr/>
+                  </pic:nvPicPr>
+                  <pic:blipFill>
+                    <a:blip r:embed="rId32"/>
+                    <a:stretch>
+                      <a:fillRect/>
+                    </a:stretch>
+                  </pic:blipFill>
+                  <pic:spPr>
+                    <a:xfrm>
+                      <a:off x="0" y="0"/>
+                      <a:ext cx="6949440" cy="3907790"/>
+                    </a:xfrm>
+                    <a:prstGeom prst="rect">
+                      <a:avLst/>
+                    </a:prstGeom>
+                  </pic:spPr>
+                </pic:pic>
+              </a:graphicData>
+            </a:graphic>
+          </wp:inline>
+        </w:drawing>
+      </w:r>
+    </w:p>
+    <w:p>
+      <w:pPr>
+        <w:pStyle w:val="Caption"/>
+        <w:jc w:val="center"/>
+        <w:rPr>
+          <w:rFonts w:ascii="Times New Roman" w:hAnsi="Times New Roman" w:cs="Times New Roman"/>
+          <w:sz w:val="28"/>
+          <w:szCs w:val="28"/>
+        </w:rPr>
+      </w:pPr>
+      <w:r>
+        <w:t xml:space="preserve">Screenshot </w:t>
+      </w:r>
+      <w:r>
+        <w:fldChar w:fldCharType="begin"/>
+      </w:r>
+      <w:r>
+        <w:instrText xml:space="preserve"> SEQ Screenshot \* ARABIC </w:instrText>
+      </w:r>
+      <w:r>
+        <w:fldChar w:fldCharType="separate"/>
+      </w:r>
+      <w:r>
+        <w:rPr>
+          <w:noProof/>
+        </w:rPr>
+        <w:t>15</w:t>
+      </w:r>
+      <w:r>
+        <w:fldChar w:fldCharType="end"/>
+      </w:r>
+      <w:r>
+        <w:t xml:space="preserve">: </w:t>
+      </w:r>
+      <w:r>
+        <w:t>Circuit from Subsection 8.5.1 - Item 5. Set the input to a 0.5 Hz, 0.1 V amplitude sine wave.  CH1+ is gain amplifier output, CH2+ is OutB</w:t>
       </w:r>
     </w:p>
     <w:p>
@@ -3654,25 +3993,997 @@
           <w:sz w:val="28"/>
           <w:szCs w:val="28"/>
         </w:rPr>
-        <w:t xml:space="preserve">Discuss the functionality and operation of each circuit built in lab, include your captured waveforms and corresponding </w:t>
-      </w:r>
-      <w:proofErr w:type="spellStart"/>
-      <w:r>
-        <w:rPr>
-          <w:rFonts w:ascii="Times New Roman" w:hAnsi="Times New Roman" w:cs="Times New Roman"/>
-          <w:sz w:val="28"/>
-          <w:szCs w:val="28"/>
-        </w:rPr>
-        <w:t>LTspice</w:t>
-      </w:r>
-      <w:proofErr w:type="spellEnd"/>
-      <w:r>
-        <w:rPr>
-          <w:rFonts w:ascii="Times New Roman" w:hAnsi="Times New Roman" w:cs="Times New Roman"/>
-          <w:sz w:val="28"/>
-          <w:szCs w:val="28"/>
-        </w:rPr>
-        <w:t xml:space="preserve"> schematics. By this point, you have worked with both op amps and comparators. Compare their similarities and differences. When would you choose an op amp over a comparator, and vice versa, based on application?</w:t>
+        <w:t>Discuss the functionality and operation of each circuit built in lab, include your captured waveforms and corresponding LTspice schematics. By this point, you have worked with both op amps and comparators. Compare their similarities and differences. When would you choose an op amp over a comparator, and vice versa, based on application?</w:t>
+      </w:r>
+    </w:p>
+    <w:p>
+      <w:pPr>
+        <w:spacing w:before="120" w:line="240" w:lineRule="auto"/>
+        <w:ind w:left="259"/>
+        <w:rPr>
+          <w:rFonts w:ascii="Times New Roman" w:hAnsi="Times New Roman" w:cs="Times New Roman"/>
+          <w:sz w:val="28"/>
+          <w:szCs w:val="28"/>
+        </w:rPr>
+      </w:pPr>
+      <w:r>
+        <w:rPr>
+          <w:rFonts w:ascii="Times New Roman" w:hAnsi="Times New Roman" w:cs="Times New Roman"/>
+          <w:sz w:val="28"/>
+          <w:szCs w:val="28"/>
+        </w:rPr>
+        <w:t>Functionality and Operation of Lab Circuits</w:t>
+      </w:r>
+    </w:p>
+    <w:p>
+      <w:pPr>
+        <w:spacing w:before="120" w:line="240" w:lineRule="auto"/>
+        <w:ind w:left="259"/>
+        <w:rPr>
+          <w:rFonts w:ascii="Times New Roman" w:hAnsi="Times New Roman" w:cs="Times New Roman"/>
+          <w:sz w:val="28"/>
+          <w:szCs w:val="28"/>
+        </w:rPr>
+      </w:pPr>
+      <w:r>
+        <w:rPr>
+          <w:rFonts w:ascii="Times New Roman" w:hAnsi="Times New Roman" w:cs="Times New Roman"/>
+          <w:sz w:val="28"/>
+          <w:szCs w:val="28"/>
+        </w:rPr>
+        <w:t xml:space="preserve">Diodes enforce a single directional current flow. Half-wave and full-bridge rectifiers convert </w:t>
+      </w:r>
+      <w:r>
+        <w:rPr>
+          <w:rFonts w:ascii="Times New Roman" w:hAnsi="Times New Roman" w:cs="Times New Roman"/>
+          <w:sz w:val="28"/>
+          <w:szCs w:val="28"/>
+        </w:rPr>
+        <w:t>bipolar</w:t>
+      </w:r>
+      <w:r>
+        <w:rPr>
+          <w:rFonts w:ascii="Times New Roman" w:hAnsi="Times New Roman" w:cs="Times New Roman"/>
+          <w:sz w:val="28"/>
+          <w:szCs w:val="28"/>
+        </w:rPr>
+        <w:t xml:space="preserve"> AC input waveforms into positive pulsating DC signals. The full-bridge configuration uses four diodes to invert the negative half-cycles of the AC input, doubling the ripple frequency and increasing average output power.</w:t>
+      </w:r>
+    </w:p>
+    <w:p>
+      <w:pPr>
+        <w:spacing w:before="120" w:line="240" w:lineRule="auto"/>
+        <w:ind w:left="259"/>
+        <w:rPr>
+          <w:rFonts w:ascii="Times New Roman" w:hAnsi="Times New Roman" w:cs="Times New Roman"/>
+          <w:sz w:val="28"/>
+          <w:szCs w:val="28"/>
+        </w:rPr>
+      </w:pPr>
+      <w:r>
+        <w:rPr>
+          <w:rFonts w:ascii="Times New Roman" w:hAnsi="Times New Roman" w:cs="Times New Roman"/>
+          <w:sz w:val="28"/>
+          <w:szCs w:val="28"/>
+        </w:rPr>
+        <w:t>The TLV272 op-amp acts as an inverting gain stage to amplify small input signals. The amplified signal feeds into a window comparator built with an LM393 dual comparator and a 3-resistor voltage divider ladder. When the amplified output crosses the upper (V</w:t>
+      </w:r>
+      <w:r>
+        <w:rPr>
+          <w:rFonts w:ascii="Times New Roman" w:hAnsi="Times New Roman" w:cs="Times New Roman"/>
+          <w:sz w:val="28"/>
+          <w:szCs w:val="28"/>
+          <w:vertAlign w:val="subscript"/>
+        </w:rPr>
+        <w:t>A</w:t>
+      </w:r>
+      <w:r>
+        <w:rPr>
+          <w:rFonts w:ascii="Times New Roman" w:hAnsi="Times New Roman" w:cs="Times New Roman"/>
+          <w:sz w:val="28"/>
+          <w:szCs w:val="28"/>
+        </w:rPr>
+        <w:t>) or lower (V</w:t>
+      </w:r>
+      <w:r>
+        <w:rPr>
+          <w:rFonts w:ascii="Times New Roman" w:hAnsi="Times New Roman" w:cs="Times New Roman"/>
+          <w:sz w:val="28"/>
+          <w:szCs w:val="28"/>
+          <w:vertAlign w:val="subscript"/>
+        </w:rPr>
+        <w:t>B</w:t>
+      </w:r>
+      <w:r>
+        <w:rPr>
+          <w:rFonts w:ascii="Times New Roman" w:hAnsi="Times New Roman" w:cs="Times New Roman"/>
+          <w:sz w:val="28"/>
+          <w:szCs w:val="28"/>
+        </w:rPr>
+        <w:t>) reference thresholds, the comparator outputs pull low to sink current through the 2.2k</w:t>
+      </w:r>
+      <w:r>
+        <w:rPr>
+          <w:rFonts w:ascii="Times New Roman" w:hAnsi="Times New Roman" w:cs="Times New Roman"/>
+          <w:sz w:val="28"/>
+          <w:szCs w:val="28"/>
+        </w:rPr>
+        <w:t>Ω</w:t>
+      </w:r>
+      <w:r>
+        <w:rPr>
+          <w:rFonts w:ascii="Times New Roman" w:hAnsi="Times New Roman" w:cs="Times New Roman"/>
+          <w:sz w:val="28"/>
+          <w:szCs w:val="28"/>
+        </w:rPr>
+        <w:t xml:space="preserve"> current-limiting resistors, illuminating the LEDs to visually show signal clipping. </w:t>
+      </w:r>
+    </w:p>
+    <w:p>
+      <w:pPr>
+        <w:spacing w:before="120" w:line="240" w:lineRule="auto"/>
+        <w:ind w:left="259"/>
+        <w:rPr>
+          <w:rFonts w:ascii="Times New Roman" w:hAnsi="Times New Roman" w:cs="Times New Roman"/>
+          <w:sz w:val="28"/>
+          <w:szCs w:val="28"/>
+        </w:rPr>
+      </w:pPr>
+      <w:r>
+        <w:rPr>
+          <w:rFonts w:ascii="Times New Roman" w:hAnsi="Times New Roman" w:cs="Times New Roman"/>
+          <w:sz w:val="28"/>
+          <w:szCs w:val="28"/>
+        </w:rPr>
+        <w:t>Op-Amp vs. Comparator:</w:t>
+      </w:r>
+    </w:p>
+    <w:p>
+      <w:pPr>
+        <w:spacing w:before="120" w:line="240" w:lineRule="auto"/>
+        <w:ind w:left="259"/>
+        <w:rPr>
+          <w:rFonts w:ascii="Times New Roman" w:hAnsi="Times New Roman" w:cs="Times New Roman"/>
+          <w:sz w:val="28"/>
+          <w:szCs w:val="28"/>
+        </w:rPr>
+      </w:pPr>
+      <w:r>
+        <w:rPr>
+          <w:rFonts w:ascii="Times New Roman" w:hAnsi="Times New Roman" w:cs="Times New Roman"/>
+          <w:sz w:val="28"/>
+          <w:szCs w:val="28"/>
+        </w:rPr>
+        <w:lastRenderedPageBreak/>
+        <w:t xml:space="preserve">Both devices are differential high-gain voltage amplifiers with non-inverting and inverting inputs. Both evaluate the difference between their input terminals. However, Op-amps are optimized for linear operations with negative feedback. They feature internal frequency compensation to prevent oscillation in closed-loop configurations and push-pull output stages that drive continuous analog voltages. Comparators are designed more for open-loop non-linear switching, </w:t>
+      </w:r>
+      <w:r>
+        <w:rPr>
+          <w:rFonts w:ascii="Times New Roman" w:hAnsi="Times New Roman" w:cs="Times New Roman"/>
+          <w:sz w:val="28"/>
+          <w:szCs w:val="28"/>
+        </w:rPr>
+        <w:t>so they</w:t>
+      </w:r>
+      <w:r>
+        <w:rPr>
+          <w:rFonts w:ascii="Times New Roman" w:hAnsi="Times New Roman" w:cs="Times New Roman"/>
+          <w:sz w:val="28"/>
+          <w:szCs w:val="28"/>
+        </w:rPr>
+        <w:t xml:space="preserve"> do not have internal phase compensation. This allows for extremely fast propagation delays and rapid switching times. They are usually used for their open-collector outputs, requiring an external pull-up resistor to define logic states. </w:t>
+      </w:r>
+    </w:p>
+    <w:p>
+      <w:pPr>
+        <w:spacing w:before="120" w:line="240" w:lineRule="auto"/>
+        <w:ind w:left="259"/>
+        <w:rPr>
+          <w:rFonts w:ascii="Times New Roman" w:hAnsi="Times New Roman" w:cs="Times New Roman"/>
+          <w:sz w:val="28"/>
+          <w:szCs w:val="28"/>
+        </w:rPr>
+      </w:pPr>
+      <w:r>
+        <w:rPr>
+          <w:rFonts w:ascii="Times New Roman" w:hAnsi="Times New Roman" w:cs="Times New Roman"/>
+          <w:sz w:val="28"/>
+          <w:szCs w:val="28"/>
+        </w:rPr>
+        <w:t>You would choose an op-amp for linear signal processing, like amplification, filtering, buffering, level shifting, or mathematical operations where continuous proportional outputs are required. Comparators would be chosen for threshold detection, zero-crossing detection, window detection, or driving digital logic/LED indicators where fast, sharp binary state transitions are needed.</w:t>
+      </w:r>
+    </w:p>
+    <w:p>
+      <w:pPr>
+        <w:spacing w:line="259" w:lineRule="auto"/>
+        <w:rPr>
+          <w:rFonts w:ascii="Times New Roman" w:hAnsi="Times New Roman" w:cs="Times New Roman"/>
+          <w:sz w:val="28"/>
+          <w:szCs w:val="28"/>
+        </w:rPr>
+      </w:pPr>
+      <w:r>
+        <w:rPr>
+          <w:rFonts w:ascii="Times New Roman" w:hAnsi="Times New Roman" w:cs="Times New Roman"/>
+          <w:sz w:val="28"/>
+          <w:szCs w:val="28"/>
+        </w:rPr>
+        <w:t>Refer back to the clipping detection circuit in Figure 7.5. For the final project, you will be asked to design a circuit where one LED turns on when the input voltage exceeds 1 V and the other LED turns on when the input voltage exceeds 4 V to indicate clipping. Calculate the resistor values needed to set the correct reference voltages using either ± 5 V supply or +5 V and GND supply for the three-resistor ladder. You do not need to get exactly 1 V and 4 V, get as close as you can only using 3 resistors. Explain your reasoning.</w:t>
+      </w:r>
+    </w:p>
+    <w:p>
+      <w:pPr>
+        <w:spacing w:line="259" w:lineRule="auto"/>
+        <w:ind w:left="259"/>
+        <w:rPr>
+          <w:rFonts w:ascii="Times New Roman" w:hAnsi="Times New Roman" w:cs="Times New Roman"/>
+          <w:sz w:val="28"/>
+          <w:szCs w:val="28"/>
+        </w:rPr>
+      </w:pPr>
+      <w:r>
+        <w:rPr>
+          <w:rFonts w:ascii="Times New Roman" w:hAnsi="Times New Roman" w:cs="Times New Roman"/>
+          <w:sz w:val="28"/>
+          <w:szCs w:val="28"/>
+        </w:rPr>
+        <w:t xml:space="preserve">To generate strictly positive reference voltages at </w:t>
+      </w:r>
+      <w:r>
+        <w:rPr>
+          <w:rFonts w:ascii="Times New Roman" w:hAnsi="Times New Roman" w:cs="Times New Roman"/>
+          <w:sz w:val="28"/>
+          <w:szCs w:val="28"/>
+        </w:rPr>
+        <w:t xml:space="preserve">1V </w:t>
+      </w:r>
+      <w:r>
+        <w:rPr>
+          <w:rFonts w:ascii="Times New Roman" w:hAnsi="Times New Roman" w:cs="Times New Roman"/>
+          <w:sz w:val="28"/>
+          <w:szCs w:val="28"/>
+        </w:rPr>
+        <w:t xml:space="preserve">and </w:t>
+      </w:r>
+      <w:r>
+        <w:rPr>
+          <w:rFonts w:ascii="Times New Roman" w:hAnsi="Times New Roman" w:cs="Times New Roman"/>
+          <w:sz w:val="28"/>
+          <w:szCs w:val="28"/>
+        </w:rPr>
+        <w:t>4V</w:t>
+      </w:r>
+      <w:r>
+        <w:rPr>
+          <w:rFonts w:ascii="Times New Roman" w:hAnsi="Times New Roman" w:cs="Times New Roman"/>
+          <w:sz w:val="28"/>
+          <w:szCs w:val="28"/>
+        </w:rPr>
+        <w:t xml:space="preserve">, using a single </w:t>
+      </w:r>
+      <w:r>
+        <w:rPr>
+          <w:rFonts w:ascii="Times New Roman" w:hAnsi="Times New Roman" w:cs="Times New Roman"/>
+          <w:b/>
+          <w:bCs/>
+          <w:sz w:val="28"/>
+          <w:szCs w:val="28"/>
+        </w:rPr>
+        <w:t>+5V</w:t>
+      </w:r>
+      <w:r>
+        <w:rPr>
+          <w:rFonts w:ascii="Times New Roman" w:hAnsi="Times New Roman" w:cs="Times New Roman"/>
+          <w:b/>
+          <w:bCs/>
+          <w:sz w:val="28"/>
+          <w:szCs w:val="28"/>
+        </w:rPr>
+        <w:t xml:space="preserve"> and GND </w:t>
+      </w:r>
+      <w:r>
+        <w:rPr>
+          <w:rFonts w:ascii="Times New Roman" w:hAnsi="Times New Roman" w:cs="Times New Roman"/>
+          <w:sz w:val="28"/>
+          <w:szCs w:val="28"/>
+        </w:rPr>
+        <w:t xml:space="preserve">supply for the 3-resistor ladder is the most efficient choice. Connecting a voltage divider between </w:t>
+      </w:r>
+      <w:r>
+        <w:rPr>
+          <w:rFonts w:ascii="Times New Roman" w:hAnsi="Times New Roman" w:cs="Times New Roman"/>
+          <w:sz w:val="28"/>
+          <w:szCs w:val="28"/>
+        </w:rPr>
+        <w:t>5V</w:t>
+      </w:r>
+      <w:r>
+        <w:rPr>
+          <w:rFonts w:ascii="Times New Roman" w:hAnsi="Times New Roman" w:cs="Times New Roman"/>
+          <w:sz w:val="28"/>
+          <w:szCs w:val="28"/>
+        </w:rPr>
+        <w:t xml:space="preserve"> and </w:t>
+      </w:r>
+      <w:r>
+        <w:rPr>
+          <w:rFonts w:ascii="Times New Roman" w:hAnsi="Times New Roman" w:cs="Times New Roman"/>
+          <w:sz w:val="28"/>
+          <w:szCs w:val="28"/>
+        </w:rPr>
+        <w:t>0V</w:t>
+      </w:r>
+      <w:r>
+        <w:rPr>
+          <w:rFonts w:ascii="Times New Roman" w:hAnsi="Times New Roman" w:cs="Times New Roman"/>
+          <w:sz w:val="28"/>
+          <w:szCs w:val="28"/>
+        </w:rPr>
+        <w:t xml:space="preserve"> inherently constrains all intermediate node voltages within the </w:t>
+      </w:r>
+      <w:r>
+        <w:rPr>
+          <w:rFonts w:ascii="Times New Roman" w:hAnsi="Times New Roman" w:cs="Times New Roman"/>
+          <w:sz w:val="28"/>
+          <w:szCs w:val="28"/>
+        </w:rPr>
+        <w:t>0V</w:t>
+      </w:r>
+      <w:r>
+        <w:rPr>
+          <w:rFonts w:ascii="Times New Roman" w:hAnsi="Times New Roman" w:cs="Times New Roman"/>
+          <w:sz w:val="28"/>
+          <w:szCs w:val="28"/>
+        </w:rPr>
+        <w:t xml:space="preserve"> to </w:t>
+      </w:r>
+      <w:r>
+        <w:rPr>
+          <w:rFonts w:ascii="Times New Roman" w:hAnsi="Times New Roman" w:cs="Times New Roman"/>
+          <w:sz w:val="28"/>
+          <w:szCs w:val="28"/>
+        </w:rPr>
+        <w:t>5V</w:t>
+      </w:r>
+      <w:r>
+        <w:rPr>
+          <w:rFonts w:ascii="Times New Roman" w:hAnsi="Times New Roman" w:cs="Times New Roman"/>
+          <w:sz w:val="28"/>
+          <w:szCs w:val="28"/>
+        </w:rPr>
+        <w:t xml:space="preserve"> range without requiring negative offsets.</w:t>
+      </w:r>
+      <w:r>
+        <w:rPr>
+          <w:rFonts w:ascii="Times New Roman" w:hAnsi="Times New Roman" w:cs="Times New Roman"/>
+          <w:sz w:val="28"/>
+          <w:szCs w:val="28"/>
+        </w:rPr>
+        <w:t xml:space="preserve"> </w:t>
+      </w:r>
+    </w:p>
+    <w:p>
+      <w:pPr>
+        <w:spacing w:line="259" w:lineRule="auto"/>
+        <w:ind w:left="259"/>
+        <w:rPr>
+          <w:rFonts w:ascii="Times New Roman" w:hAnsi="Times New Roman" w:cs="Times New Roman"/>
+          <w:sz w:val="28"/>
+          <w:szCs w:val="28"/>
+        </w:rPr>
+      </w:pPr>
+      <w:r>
+        <w:rPr>
+          <w:rFonts w:ascii="Times New Roman" w:hAnsi="Times New Roman" w:cs="Times New Roman"/>
+          <w:sz w:val="28"/>
+          <w:szCs w:val="28"/>
+        </w:rPr>
+        <w:t>+5V-R1</w:t>
+      </w:r>
+      <w:r>
+        <w:rPr>
+          <w:rFonts w:ascii="Times New Roman" w:hAnsi="Times New Roman" w:cs="Times New Roman"/>
+          <w:sz w:val="28"/>
+          <w:szCs w:val="28"/>
+        </w:rPr>
+        <w:t>=4V-</w:t>
+      </w:r>
+      <w:r>
+        <w:rPr>
+          <w:rFonts w:ascii="Times New Roman" w:hAnsi="Times New Roman" w:cs="Times New Roman"/>
+          <w:sz w:val="28"/>
+          <w:szCs w:val="28"/>
+        </w:rPr>
+        <w:t>R2-VB</w:t>
+      </w:r>
+      <w:r>
+        <w:rPr>
+          <w:rFonts w:ascii="Times New Roman" w:hAnsi="Times New Roman" w:cs="Times New Roman"/>
+          <w:sz w:val="28"/>
+          <w:szCs w:val="28"/>
+        </w:rPr>
+        <w:t>-1V-</w:t>
+      </w:r>
+      <w:r>
+        <w:rPr>
+          <w:rFonts w:ascii="Times New Roman" w:hAnsi="Times New Roman" w:cs="Times New Roman"/>
+          <w:sz w:val="28"/>
+          <w:szCs w:val="28"/>
+        </w:rPr>
+        <w:t>R3-GND</w:t>
+      </w:r>
+    </w:p>
+    <w:p>
+      <w:pPr>
+        <w:spacing w:line="259" w:lineRule="auto"/>
+        <w:ind w:left="259"/>
+        <w:rPr>
+          <w:rFonts w:ascii="Times New Roman" w:hAnsi="Times New Roman" w:cs="Times New Roman"/>
+          <w:sz w:val="28"/>
+          <w:szCs w:val="28"/>
+        </w:rPr>
+      </w:pPr>
+      <w:r>
+        <w:rPr>
+          <w:rFonts w:ascii="Times New Roman" w:hAnsi="Times New Roman" w:cs="Times New Roman"/>
+          <w:sz w:val="28"/>
+          <w:szCs w:val="28"/>
+        </w:rPr>
+        <w:t xml:space="preserve">Let the current flowing down the resistor ladder be </w:t>
+      </w:r>
+      <w:r>
+        <w:rPr>
+          <w:rFonts w:ascii="Times New Roman" w:hAnsi="Times New Roman" w:cs="Times New Roman"/>
+          <w:sz w:val="28"/>
+          <w:szCs w:val="28"/>
+        </w:rPr>
+        <w:t>I</w:t>
+      </w:r>
+      <w:r>
+        <w:rPr>
+          <w:rFonts w:ascii="Times New Roman" w:hAnsi="Times New Roman" w:cs="Times New Roman"/>
+          <w:sz w:val="28"/>
+          <w:szCs w:val="28"/>
+        </w:rPr>
+        <w:t xml:space="preserve">. The target node voltages are </w:t>
+      </w:r>
+      <w:r>
+        <w:rPr>
+          <w:rFonts w:ascii="Times New Roman" w:hAnsi="Times New Roman" w:cs="Times New Roman"/>
+          <w:sz w:val="28"/>
+          <w:szCs w:val="28"/>
+        </w:rPr>
+        <w:t>V</w:t>
+      </w:r>
+      <w:r>
+        <w:rPr>
+          <w:rFonts w:ascii="Times New Roman" w:hAnsi="Times New Roman" w:cs="Times New Roman"/>
+          <w:sz w:val="28"/>
+          <w:szCs w:val="28"/>
+          <w:vertAlign w:val="subscript"/>
+        </w:rPr>
+        <w:t>A</w:t>
+      </w:r>
+      <w:r>
+        <w:rPr>
+          <w:rFonts w:ascii="Times New Roman" w:hAnsi="Times New Roman" w:cs="Times New Roman"/>
+          <w:sz w:val="28"/>
+          <w:szCs w:val="28"/>
+        </w:rPr>
+        <w:t xml:space="preserve"> = </w:t>
+      </w:r>
+      <w:r>
+        <w:rPr>
+          <w:rFonts w:ascii="Times New Roman" w:hAnsi="Times New Roman" w:cs="Times New Roman"/>
+          <w:sz w:val="28"/>
+          <w:szCs w:val="28"/>
+        </w:rPr>
+        <w:t>4V</w:t>
+      </w:r>
+      <w:r>
+        <w:rPr>
+          <w:rFonts w:ascii="Times New Roman" w:hAnsi="Times New Roman" w:cs="Times New Roman"/>
+          <w:sz w:val="28"/>
+          <w:szCs w:val="28"/>
+        </w:rPr>
+        <w:t xml:space="preserve"> and </w:t>
+      </w:r>
+      <w:r>
+        <w:rPr>
+          <w:rFonts w:ascii="Times New Roman" w:hAnsi="Times New Roman" w:cs="Times New Roman"/>
+          <w:sz w:val="28"/>
+          <w:szCs w:val="28"/>
+        </w:rPr>
+        <w:t>V</w:t>
+      </w:r>
+      <w:r>
+        <w:rPr>
+          <w:rFonts w:ascii="Times New Roman" w:hAnsi="Times New Roman" w:cs="Times New Roman"/>
+          <w:sz w:val="28"/>
+          <w:szCs w:val="28"/>
+          <w:vertAlign w:val="subscript"/>
+        </w:rPr>
+        <w:t>B</w:t>
+      </w:r>
+      <w:r>
+        <w:rPr>
+          <w:rFonts w:ascii="Times New Roman" w:hAnsi="Times New Roman" w:cs="Times New Roman"/>
+          <w:sz w:val="28"/>
+          <w:szCs w:val="28"/>
+        </w:rPr>
+        <w:t xml:space="preserve"> = 1V</w:t>
+      </w:r>
+      <w:r>
+        <w:rPr>
+          <w:rFonts w:ascii="Times New Roman" w:hAnsi="Times New Roman" w:cs="Times New Roman"/>
+          <w:sz w:val="28"/>
+          <w:szCs w:val="28"/>
+        </w:rPr>
+        <w:t>:</w:t>
+      </w:r>
+      <w:r>
+        <w:rPr>
+          <w:rFonts w:ascii="Times New Roman" w:hAnsi="Times New Roman" w:cs="Times New Roman"/>
+          <w:sz w:val="28"/>
+          <w:szCs w:val="28"/>
+        </w:rPr>
+        <w:t xml:space="preserve"> </w:t>
+      </w:r>
+    </w:p>
+    <w:p>
+      <w:pPr>
+        <w:spacing w:line="259" w:lineRule="auto"/>
+        <w:ind w:left="259"/>
+        <w:rPr>
+          <w:rFonts w:ascii="Times New Roman" w:hAnsi="Times New Roman" w:cs="Times New Roman"/>
+          <w:sz w:val="28"/>
+          <w:szCs w:val="28"/>
+        </w:rPr>
+      </w:pPr>
+      <w:r>
+        <w:rPr>
+          <w:rFonts w:ascii="Times New Roman" w:hAnsi="Times New Roman" w:cs="Times New Roman"/>
+          <w:sz w:val="28"/>
+          <w:szCs w:val="28"/>
+        </w:rPr>
+        <w:t>Voltage Across Bottom Resistor (R</w:t>
+      </w:r>
+      <w:r>
+        <w:rPr>
+          <w:rFonts w:ascii="Times New Roman" w:hAnsi="Times New Roman" w:cs="Times New Roman"/>
+          <w:sz w:val="28"/>
+          <w:szCs w:val="28"/>
+          <w:vertAlign w:val="subscript"/>
+        </w:rPr>
+        <w:t>3</w:t>
+      </w:r>
+      <w:r>
+        <w:rPr>
+          <w:rFonts w:ascii="Times New Roman" w:hAnsi="Times New Roman" w:cs="Times New Roman"/>
+          <w:sz w:val="28"/>
+          <w:szCs w:val="28"/>
+        </w:rPr>
+        <w:t xml:space="preserve">): </w:t>
+      </w:r>
+      <w:r>
+        <w:rPr>
+          <w:rFonts w:ascii="Times New Roman" w:hAnsi="Times New Roman" w:cs="Times New Roman"/>
+          <w:sz w:val="28"/>
+          <w:szCs w:val="28"/>
+        </w:rPr>
+        <w:t>V</w:t>
+      </w:r>
+      <w:r>
+        <w:rPr>
+          <w:rFonts w:ascii="Times New Roman" w:hAnsi="Times New Roman" w:cs="Times New Roman"/>
+          <w:sz w:val="28"/>
+          <w:szCs w:val="28"/>
+          <w:vertAlign w:val="subscript"/>
+        </w:rPr>
+        <w:t>B</w:t>
+      </w:r>
+      <w:r>
+        <w:rPr>
+          <w:rFonts w:ascii="Times New Roman" w:hAnsi="Times New Roman" w:cs="Times New Roman"/>
+          <w:sz w:val="28"/>
+          <w:szCs w:val="28"/>
+        </w:rPr>
+        <w:t xml:space="preserve"> – 0V = 1V -&gt; I * R</w:t>
+      </w:r>
+      <w:r>
+        <w:rPr>
+          <w:rFonts w:ascii="Times New Roman" w:hAnsi="Times New Roman" w:cs="Times New Roman"/>
+          <w:sz w:val="28"/>
+          <w:szCs w:val="28"/>
+          <w:vertAlign w:val="subscript"/>
+        </w:rPr>
+        <w:t>3</w:t>
+      </w:r>
+      <w:r>
+        <w:rPr>
+          <w:rFonts w:ascii="Times New Roman" w:hAnsi="Times New Roman" w:cs="Times New Roman"/>
+          <w:sz w:val="28"/>
+          <w:szCs w:val="28"/>
+        </w:rPr>
+        <w:t xml:space="preserve"> = 1V</w:t>
+      </w:r>
+    </w:p>
+    <w:p>
+      <w:pPr>
+        <w:spacing w:line="259" w:lineRule="auto"/>
+        <w:ind w:left="259"/>
+        <w:rPr>
+          <w:rFonts w:ascii="Times New Roman" w:hAnsi="Times New Roman" w:cs="Times New Roman"/>
+          <w:sz w:val="28"/>
+          <w:szCs w:val="28"/>
+        </w:rPr>
+      </w:pPr>
+      <w:r>
+        <w:rPr>
+          <w:rFonts w:ascii="Times New Roman" w:hAnsi="Times New Roman" w:cs="Times New Roman"/>
+          <w:sz w:val="28"/>
+          <w:szCs w:val="28"/>
+        </w:rPr>
+        <w:t>Voltage Across Middle Resistor (R</w:t>
+      </w:r>
+      <w:r>
+        <w:rPr>
+          <w:rFonts w:ascii="Times New Roman" w:hAnsi="Times New Roman" w:cs="Times New Roman"/>
+          <w:sz w:val="28"/>
+          <w:szCs w:val="28"/>
+          <w:vertAlign w:val="subscript"/>
+        </w:rPr>
+        <w:t>2</w:t>
+      </w:r>
+      <w:r>
+        <w:rPr>
+          <w:rFonts w:ascii="Times New Roman" w:hAnsi="Times New Roman" w:cs="Times New Roman"/>
+          <w:sz w:val="28"/>
+          <w:szCs w:val="28"/>
+        </w:rPr>
+        <w:t>): V</w:t>
+      </w:r>
+      <w:r>
+        <w:rPr>
+          <w:rFonts w:ascii="Times New Roman" w:hAnsi="Times New Roman" w:cs="Times New Roman"/>
+          <w:sz w:val="28"/>
+          <w:szCs w:val="28"/>
+          <w:vertAlign w:val="subscript"/>
+        </w:rPr>
+        <w:t>A</w:t>
+      </w:r>
+      <w:r>
+        <w:rPr>
+          <w:rFonts w:ascii="Times New Roman" w:hAnsi="Times New Roman" w:cs="Times New Roman"/>
+          <w:sz w:val="28"/>
+          <w:szCs w:val="28"/>
+        </w:rPr>
+        <w:t xml:space="preserve"> – V</w:t>
+      </w:r>
+      <w:r>
+        <w:rPr>
+          <w:rFonts w:ascii="Times New Roman" w:hAnsi="Times New Roman" w:cs="Times New Roman"/>
+          <w:sz w:val="28"/>
+          <w:szCs w:val="28"/>
+          <w:vertAlign w:val="subscript"/>
+        </w:rPr>
+        <w:t>B</w:t>
+      </w:r>
+      <w:r>
+        <w:rPr>
+          <w:rFonts w:ascii="Times New Roman" w:hAnsi="Times New Roman" w:cs="Times New Roman"/>
+          <w:sz w:val="28"/>
+          <w:szCs w:val="28"/>
+        </w:rPr>
+        <w:t xml:space="preserve"> = 4V – 1V = 3V -&gt; I * R</w:t>
+      </w:r>
+      <w:r>
+        <w:rPr>
+          <w:rFonts w:ascii="Times New Roman" w:hAnsi="Times New Roman" w:cs="Times New Roman"/>
+          <w:sz w:val="28"/>
+          <w:szCs w:val="28"/>
+          <w:vertAlign w:val="subscript"/>
+        </w:rPr>
+        <w:t>2</w:t>
+      </w:r>
+      <w:r>
+        <w:rPr>
+          <w:rFonts w:ascii="Times New Roman" w:hAnsi="Times New Roman" w:cs="Times New Roman"/>
+          <w:sz w:val="28"/>
+          <w:szCs w:val="28"/>
+        </w:rPr>
+        <w:t xml:space="preserve"> = 3V</w:t>
+      </w:r>
+    </w:p>
+    <w:p>
+      <w:pPr>
+        <w:spacing w:line="259" w:lineRule="auto"/>
+        <w:ind w:left="259"/>
+        <w:rPr>
+          <w:rFonts w:ascii="Times New Roman" w:hAnsi="Times New Roman" w:cs="Times New Roman"/>
+          <w:sz w:val="28"/>
+          <w:szCs w:val="28"/>
+        </w:rPr>
+      </w:pPr>
+      <w:r>
+        <w:rPr>
+          <w:rFonts w:ascii="Times New Roman" w:hAnsi="Times New Roman" w:cs="Times New Roman"/>
+          <w:sz w:val="28"/>
+          <w:szCs w:val="28"/>
+        </w:rPr>
+        <w:t>Voltage Across Top Resistor (R</w:t>
+      </w:r>
+      <w:r>
+        <w:rPr>
+          <w:rFonts w:ascii="Times New Roman" w:hAnsi="Times New Roman" w:cs="Times New Roman"/>
+          <w:sz w:val="28"/>
+          <w:szCs w:val="28"/>
+          <w:vertAlign w:val="subscript"/>
+        </w:rPr>
+        <w:t>1</w:t>
+      </w:r>
+      <w:r>
+        <w:rPr>
+          <w:rFonts w:ascii="Times New Roman" w:hAnsi="Times New Roman" w:cs="Times New Roman"/>
+          <w:sz w:val="28"/>
+          <w:szCs w:val="28"/>
+        </w:rPr>
+        <w:t>): 5V – V</w:t>
+      </w:r>
+      <w:r>
+        <w:rPr>
+          <w:rFonts w:ascii="Times New Roman" w:hAnsi="Times New Roman" w:cs="Times New Roman"/>
+          <w:sz w:val="28"/>
+          <w:szCs w:val="28"/>
+          <w:vertAlign w:val="subscript"/>
+        </w:rPr>
+        <w:t>A</w:t>
+      </w:r>
+      <w:r>
+        <w:rPr>
+          <w:rFonts w:ascii="Times New Roman" w:hAnsi="Times New Roman" w:cs="Times New Roman"/>
+          <w:sz w:val="28"/>
+          <w:szCs w:val="28"/>
+        </w:rPr>
+        <w:t xml:space="preserve"> = 5V-4V=1V -&gt; I * R</w:t>
+      </w:r>
+      <w:r>
+        <w:rPr>
+          <w:rFonts w:ascii="Times New Roman" w:hAnsi="Times New Roman" w:cs="Times New Roman"/>
+          <w:sz w:val="28"/>
+          <w:szCs w:val="28"/>
+          <w:vertAlign w:val="subscript"/>
+        </w:rPr>
+        <w:t>1</w:t>
+      </w:r>
+      <w:r>
+        <w:rPr>
+          <w:rFonts w:ascii="Times New Roman" w:hAnsi="Times New Roman" w:cs="Times New Roman"/>
+          <w:sz w:val="28"/>
+          <w:szCs w:val="28"/>
+        </w:rPr>
+        <w:t xml:space="preserve"> = 1V</w:t>
+      </w:r>
+    </w:p>
+    <w:p>
+      <w:pPr>
+        <w:spacing w:line="259" w:lineRule="auto"/>
+        <w:ind w:left="259"/>
+        <w:rPr>
+          <w:rFonts w:ascii="Times New Roman" w:hAnsi="Times New Roman" w:cs="Times New Roman"/>
+          <w:sz w:val="28"/>
+          <w:szCs w:val="28"/>
+        </w:rPr>
+      </w:pPr>
+      <w:r>
+        <w:rPr>
+          <w:rFonts w:ascii="Times New Roman" w:hAnsi="Times New Roman" w:cs="Times New Roman"/>
+          <w:sz w:val="28"/>
+          <w:szCs w:val="28"/>
+        </w:rPr>
+        <w:t>Dividing the equations yields the required resistance ratios:</w:t>
+      </w:r>
+      <w:r>
+        <w:rPr>
+          <w:rFonts w:ascii="Times New Roman" w:hAnsi="Times New Roman" w:cs="Times New Roman"/>
+          <w:sz w:val="28"/>
+          <w:szCs w:val="28"/>
+        </w:rPr>
+        <w:t xml:space="preserve"> R</w:t>
+      </w:r>
+      <w:r>
+        <w:rPr>
+          <w:rFonts w:ascii="Times New Roman" w:hAnsi="Times New Roman" w:cs="Times New Roman"/>
+          <w:sz w:val="28"/>
+          <w:szCs w:val="28"/>
+          <w:vertAlign w:val="subscript"/>
+        </w:rPr>
+        <w:t>1</w:t>
+      </w:r>
+      <w:r>
+        <w:rPr>
+          <w:rFonts w:ascii="Times New Roman" w:hAnsi="Times New Roman" w:cs="Times New Roman"/>
+          <w:sz w:val="28"/>
+          <w:szCs w:val="28"/>
+        </w:rPr>
+        <w:t>/R</w:t>
+      </w:r>
+      <w:r>
+        <w:rPr>
+          <w:rFonts w:ascii="Times New Roman" w:hAnsi="Times New Roman" w:cs="Times New Roman"/>
+          <w:sz w:val="28"/>
+          <w:szCs w:val="28"/>
+          <w:vertAlign w:val="subscript"/>
+        </w:rPr>
+        <w:t>3</w:t>
+      </w:r>
+      <w:r>
+        <w:rPr>
+          <w:rFonts w:ascii="Times New Roman" w:hAnsi="Times New Roman" w:cs="Times New Roman"/>
+          <w:sz w:val="28"/>
+          <w:szCs w:val="28"/>
+        </w:rPr>
+        <w:t xml:space="preserve"> = 1V/1V = R</w:t>
+      </w:r>
+      <w:r>
+        <w:rPr>
+          <w:rFonts w:ascii="Times New Roman" w:hAnsi="Times New Roman" w:cs="Times New Roman"/>
+          <w:sz w:val="28"/>
+          <w:szCs w:val="28"/>
+          <w:vertAlign w:val="subscript"/>
+        </w:rPr>
+        <w:t>1</w:t>
+      </w:r>
+      <w:r>
+        <w:rPr>
+          <w:rFonts w:ascii="Times New Roman" w:hAnsi="Times New Roman" w:cs="Times New Roman"/>
+          <w:sz w:val="28"/>
+          <w:szCs w:val="28"/>
+        </w:rPr>
+        <w:t>=R</w:t>
+      </w:r>
+      <w:r>
+        <w:rPr>
+          <w:rFonts w:ascii="Times New Roman" w:hAnsi="Times New Roman" w:cs="Times New Roman"/>
+          <w:sz w:val="28"/>
+          <w:szCs w:val="28"/>
+          <w:vertAlign w:val="subscript"/>
+        </w:rPr>
+        <w:t>3</w:t>
+      </w:r>
+      <w:r>
+        <w:rPr>
+          <w:rFonts w:ascii="Times New Roman" w:hAnsi="Times New Roman" w:cs="Times New Roman"/>
+          <w:sz w:val="28"/>
+          <w:szCs w:val="28"/>
+        </w:rPr>
+        <w:t>; R</w:t>
+      </w:r>
+      <w:r>
+        <w:rPr>
+          <w:rFonts w:ascii="Times New Roman" w:hAnsi="Times New Roman" w:cs="Times New Roman"/>
+          <w:sz w:val="28"/>
+          <w:szCs w:val="28"/>
+          <w:vertAlign w:val="subscript"/>
+        </w:rPr>
+        <w:t>2</w:t>
+      </w:r>
+      <w:r>
+        <w:rPr>
+          <w:rFonts w:ascii="Times New Roman" w:hAnsi="Times New Roman" w:cs="Times New Roman"/>
+          <w:sz w:val="28"/>
+          <w:szCs w:val="28"/>
+        </w:rPr>
+        <w:t>/R</w:t>
+      </w:r>
+      <w:r>
+        <w:rPr>
+          <w:rFonts w:ascii="Times New Roman" w:hAnsi="Times New Roman" w:cs="Times New Roman"/>
+          <w:sz w:val="28"/>
+          <w:szCs w:val="28"/>
+          <w:vertAlign w:val="subscript"/>
+        </w:rPr>
+        <w:t>3</w:t>
+      </w:r>
+      <w:r>
+        <w:rPr>
+          <w:rFonts w:ascii="Times New Roman" w:hAnsi="Times New Roman" w:cs="Times New Roman"/>
+          <w:sz w:val="28"/>
+          <w:szCs w:val="28"/>
+        </w:rPr>
+        <w:t xml:space="preserve"> = 3V/1V = 3 = R</w:t>
+      </w:r>
+      <w:r>
+        <w:rPr>
+          <w:rFonts w:ascii="Times New Roman" w:hAnsi="Times New Roman" w:cs="Times New Roman"/>
+          <w:sz w:val="28"/>
+          <w:szCs w:val="28"/>
+          <w:vertAlign w:val="subscript"/>
+        </w:rPr>
+        <w:t>2</w:t>
+      </w:r>
+      <w:r>
+        <w:rPr>
+          <w:rFonts w:ascii="Times New Roman" w:hAnsi="Times New Roman" w:cs="Times New Roman"/>
+          <w:sz w:val="28"/>
+          <w:szCs w:val="28"/>
+        </w:rPr>
+        <w:t xml:space="preserve"> = 3</w:t>
+      </w:r>
+      <w:r>
+        <w:rPr>
+          <w:rFonts w:ascii="Times New Roman" w:hAnsi="Times New Roman" w:cs="Times New Roman"/>
+          <w:sz w:val="28"/>
+          <w:szCs w:val="28"/>
+        </w:rPr>
+        <w:t>R3</w:t>
+      </w:r>
+    </w:p>
+    <w:p>
+      <w:pPr>
+        <w:spacing w:line="259" w:lineRule="auto"/>
+        <w:ind w:left="259"/>
+        <w:rPr>
+          <w:rFonts w:ascii="Times New Roman" w:hAnsi="Times New Roman" w:cs="Times New Roman"/>
+          <w:sz w:val="28"/>
+          <w:szCs w:val="28"/>
+        </w:rPr>
+      </w:pPr>
+      <w:r>
+        <w:rPr>
+          <w:rFonts w:ascii="Times New Roman" w:hAnsi="Times New Roman" w:cs="Times New Roman"/>
+          <w:sz w:val="28"/>
+          <w:szCs w:val="28"/>
+        </w:rPr>
+        <w:t>Selecting the standard Parts. R3 = 10 kΩ, R1= 10 k</w:t>
+      </w:r>
+      <w:r>
+        <w:rPr>
+          <w:rFonts w:ascii="Times New Roman" w:hAnsi="Times New Roman" w:cs="Times New Roman"/>
+          <w:sz w:val="28"/>
+          <w:szCs w:val="28"/>
+        </w:rPr>
+        <w:t>Ω</w:t>
+      </w:r>
+      <w:r>
+        <w:rPr>
+          <w:rFonts w:ascii="Times New Roman" w:hAnsi="Times New Roman" w:cs="Times New Roman"/>
+          <w:sz w:val="28"/>
+          <w:szCs w:val="28"/>
+        </w:rPr>
+        <w:t>, R2 = 33k</w:t>
+      </w:r>
+      <w:r>
+        <w:rPr>
+          <w:rFonts w:ascii="Times New Roman" w:hAnsi="Times New Roman" w:cs="Times New Roman"/>
+          <w:sz w:val="28"/>
+          <w:szCs w:val="28"/>
+        </w:rPr>
+        <w:t>Ω</w:t>
+      </w:r>
+      <w:r>
+        <w:rPr>
+          <w:rFonts w:ascii="Times New Roman" w:hAnsi="Times New Roman" w:cs="Times New Roman"/>
+          <w:sz w:val="28"/>
+          <w:szCs w:val="28"/>
+        </w:rPr>
+        <w:t xml:space="preserve"> (since it's closest to 30 k</w:t>
+      </w:r>
+      <w:r>
+        <w:rPr>
+          <w:rFonts w:ascii="Times New Roman" w:hAnsi="Times New Roman" w:cs="Times New Roman"/>
+          <w:sz w:val="28"/>
+          <w:szCs w:val="28"/>
+        </w:rPr>
+        <w:t>Ω</w:t>
+      </w:r>
+      <w:r>
+        <w:rPr>
+          <w:rFonts w:ascii="Times New Roman" w:hAnsi="Times New Roman" w:cs="Times New Roman"/>
+          <w:sz w:val="28"/>
+          <w:szCs w:val="28"/>
+        </w:rPr>
+        <w:t>)</w:t>
       </w:r>
     </w:p>
     <w:p>
@@ -3685,14 +4996,6 @@
           <w:sz w:val="24"/>
         </w:rPr>
       </w:pPr>
-      <w:r>
-        <w:rPr>
-          <w:rFonts w:ascii="Times New Roman" w:hAnsi="Times New Roman" w:cs="Times New Roman"/>
-          <w:sz w:val="28"/>
-          <w:szCs w:val="28"/>
-        </w:rPr>
-        <w:t>Refer back to the clipping detection circuit in Figure 7.5. For the final project, you will be asked to design a circuit where one LED turns on when the input voltage exceeds 1 V and the other LED turns on when the input voltage exceeds 4 V to indicate clipping. Calculate the resistor values needed to set the correct reference voltages using either ± 5 V supply or +5 V and GND supply for the three-resistor ladder. You do not need to get exactly 1 V and 4 V, get as close as you can only using 3 resistors. Explain your reasoning.</w:t>
-      </w:r>
     </w:p>
     <w:p>
       <w:pPr>
@@ -3724,23 +5027,19 @@
           <w:szCs w:val="24"/>
         </w:rPr>
       </w:pPr>
-      <w:proofErr w:type="spellStart"/>
-      <w:r>
-        <w:rPr>
-          <w:rStyle w:val="Strong"/>
-          <w:rFonts w:ascii="Times New Roman" w:hAnsi="Times New Roman" w:cs="Times New Roman"/>
-          <w:b w:val="0"/>
-          <w:bCs w:val="0"/>
+      <w:r>
+        <w:rPr>
+          <w:rFonts w:ascii="Times New Roman" w:hAnsi="Times New Roman" w:cs="Times New Roman"/>
           <w:sz w:val="24"/>
           <w:szCs w:val="24"/>
         </w:rPr>
-        <w:t>kdk</w:t>
-      </w:r>
-      <w:proofErr w:type="spellEnd"/>
+        <w:lastRenderedPageBreak/>
+        <w:t>This lab successfully demonstrated the application of operational amplifiers for signal conditioning tasks. By simulating and constructing buffer circuits, level shifters, and difference amplifiers, the ability to isolate circuit stages, manipulate DC offsets, and extract differential signals while rejecting common-mode noise was validated.</w:t>
+      </w:r>
     </w:p>
     <w:sectPr>
-      <w:headerReference w:type="default" r:id="rId23"/>
-      <w:headerReference w:type="first" r:id="rId24"/>
+      <w:headerReference w:type="default" r:id="rId33"/>
+      <w:headerReference w:type="first" r:id="rId34"/>
       <w:pgSz w:w="12240" w:h="15840"/>
       <w:pgMar w:top="576" w:right="648" w:bottom="806" w:left="648" w:header="288" w:footer="144" w:gutter="0"/>
       <w:cols w:space="720"/>
@@ -6493,7 +7792,6 @@
   <w:style w:type="character" w:default="1" w:styleId="DefaultParagraphFont">
     <w:name w:val="Default Paragraph Font"/>
     <w:uiPriority w:val="1"/>
-    <w:semiHidden/>
     <w:unhideWhenUsed/>
   </w:style>
   <w:style w:type="table" w:default="1" w:styleId="TableNormal">

</xml_diff>